<commit_message>
changed to just agricultural households
</commit_message>
<xml_diff>
--- a/output/tables/main_results_clustered.docx
+++ b/output/tables/main_results_clustered.docx
@@ -128,73 +128,73 @@
               <w:pStyle w:val="Compact"/>
             </w:pPr>
             <w:r>
-              <w:t xml:space="preserve">13.728</w:t>
-            </w:r>
-          </w:p>
-        </w:tc>
-        <w:tc>
-          <w:tcPr/>
-          <w:p>
-            <w:pPr>
-              <w:pStyle w:val="Compact"/>
-            </w:pPr>
-            <w:r>
-              <w:t xml:space="preserve">13.732</w:t>
-            </w:r>
-          </w:p>
-        </w:tc>
-        <w:tc>
-          <w:tcPr/>
-          <w:p>
-            <w:pPr>
-              <w:pStyle w:val="Compact"/>
-            </w:pPr>
-            <w:r>
-              <w:t xml:space="preserve">13.651</w:t>
-            </w:r>
-          </w:p>
-        </w:tc>
-        <w:tc>
-          <w:tcPr/>
-          <w:p>
-            <w:pPr>
-              <w:pStyle w:val="Compact"/>
-            </w:pPr>
-            <w:r>
-              <w:t xml:space="preserve">13.845</w:t>
-            </w:r>
-          </w:p>
-        </w:tc>
-        <w:tc>
-          <w:tcPr/>
-          <w:p>
-            <w:pPr>
-              <w:pStyle w:val="Compact"/>
-            </w:pPr>
-            <w:r>
-              <w:t xml:space="preserve">13.971</w:t>
-            </w:r>
-          </w:p>
-        </w:tc>
-        <w:tc>
-          <w:tcPr/>
-          <w:p>
-            <w:pPr>
-              <w:pStyle w:val="Compact"/>
-            </w:pPr>
-            <w:r>
-              <w:t xml:space="preserve">14.208</w:t>
-            </w:r>
-          </w:p>
-        </w:tc>
-        <w:tc>
-          <w:tcPr/>
-          <w:p>
-            <w:pPr>
-              <w:pStyle w:val="Compact"/>
-            </w:pPr>
-            <w:r>
-              <w:t xml:space="preserve">14.777</w:t>
+              <w:t xml:space="preserve">13.922</w:t>
+            </w:r>
+          </w:p>
+        </w:tc>
+        <w:tc>
+          <w:tcPr/>
+          <w:p>
+            <w:pPr>
+              <w:pStyle w:val="Compact"/>
+            </w:pPr>
+            <w:r>
+              <w:t xml:space="preserve">13.938</w:t>
+            </w:r>
+          </w:p>
+        </w:tc>
+        <w:tc>
+          <w:tcPr/>
+          <w:p>
+            <w:pPr>
+              <w:pStyle w:val="Compact"/>
+            </w:pPr>
+            <w:r>
+              <w:t xml:space="preserve">13.832</w:t>
+            </w:r>
+          </w:p>
+        </w:tc>
+        <w:tc>
+          <w:tcPr/>
+          <w:p>
+            <w:pPr>
+              <w:pStyle w:val="Compact"/>
+            </w:pPr>
+            <w:r>
+              <w:t xml:space="preserve">14.875</w:t>
+            </w:r>
+          </w:p>
+        </w:tc>
+        <w:tc>
+          <w:tcPr/>
+          <w:p>
+            <w:pPr>
+              <w:pStyle w:val="Compact"/>
+            </w:pPr>
+            <w:r>
+              <w:t xml:space="preserve">14.241</w:t>
+            </w:r>
+          </w:p>
+        </w:tc>
+        <w:tc>
+          <w:tcPr/>
+          <w:p>
+            <w:pPr>
+              <w:pStyle w:val="Compact"/>
+            </w:pPr>
+            <w:r>
+              <w:t xml:space="preserve">14.569</w:t>
+            </w:r>
+          </w:p>
+        </w:tc>
+        <w:tc>
+          <w:tcPr/>
+          <w:p>
+            <w:pPr>
+              <w:pStyle w:val="Compact"/>
+            </w:pPr>
+            <w:r>
+              <w:t xml:space="preserve">14.712</w:t>
             </w:r>
           </w:p>
         </w:tc>
@@ -215,73 +215,73 @@
               <w:pStyle w:val="Compact"/>
             </w:pPr>
             <w:r>
-              <w:t xml:space="preserve">(0.039)</w:t>
-            </w:r>
-          </w:p>
-        </w:tc>
-        <w:tc>
-          <w:tcPr/>
-          <w:p>
-            <w:pPr>
-              <w:pStyle w:val="Compact"/>
-            </w:pPr>
-            <w:r>
-              <w:t xml:space="preserve">(0.054)</w:t>
-            </w:r>
-          </w:p>
-        </w:tc>
-        <w:tc>
-          <w:tcPr/>
-          <w:p>
-            <w:pPr>
-              <w:pStyle w:val="Compact"/>
-            </w:pPr>
-            <w:r>
-              <w:t xml:space="preserve">(0.049)</w:t>
-            </w:r>
-          </w:p>
-        </w:tc>
-        <w:tc>
-          <w:tcPr/>
-          <w:p>
-            <w:pPr>
-              <w:pStyle w:val="Compact"/>
-            </w:pPr>
-            <w:r>
-              <w:t xml:space="preserve">(0.049)</w:t>
-            </w:r>
-          </w:p>
-        </w:tc>
-        <w:tc>
-          <w:tcPr/>
-          <w:p>
-            <w:pPr>
-              <w:pStyle w:val="Compact"/>
-            </w:pPr>
-            <w:r>
-              <w:t xml:space="preserve">(0.052)</w:t>
-            </w:r>
-          </w:p>
-        </w:tc>
-        <w:tc>
-          <w:tcPr/>
-          <w:p>
-            <w:pPr>
-              <w:pStyle w:val="Compact"/>
-            </w:pPr>
-            <w:r>
-              <w:t xml:space="preserve">(0.079)</w:t>
-            </w:r>
-          </w:p>
-        </w:tc>
-        <w:tc>
-          <w:tcPr/>
-          <w:p>
-            <w:pPr>
-              <w:pStyle w:val="Compact"/>
-            </w:pPr>
-            <w:r>
-              <w:t xml:space="preserve">(0.034)</w:t>
+              <w:t xml:space="preserve">(0.119)</w:t>
+            </w:r>
+          </w:p>
+        </w:tc>
+        <w:tc>
+          <w:tcPr/>
+          <w:p>
+            <w:pPr>
+              <w:pStyle w:val="Compact"/>
+            </w:pPr>
+            <w:r>
+              <w:t xml:space="preserve">(0.126)</w:t>
+            </w:r>
+          </w:p>
+        </w:tc>
+        <w:tc>
+          <w:tcPr/>
+          <w:p>
+            <w:pPr>
+              <w:pStyle w:val="Compact"/>
+            </w:pPr>
+            <w:r>
+              <w:t xml:space="preserve">(0.443)</w:t>
+            </w:r>
+          </w:p>
+        </w:tc>
+        <w:tc>
+          <w:tcPr/>
+          <w:p>
+            <w:pPr>
+              <w:pStyle w:val="Compact"/>
+            </w:pPr>
+            <w:r>
+              <w:t xml:space="preserve">(0.085)</w:t>
+            </w:r>
+          </w:p>
+        </w:tc>
+        <w:tc>
+          <w:tcPr/>
+          <w:p>
+            <w:pPr>
+              <w:pStyle w:val="Compact"/>
+            </w:pPr>
+            <w:r>
+              <w:t xml:space="preserve">(0.121)</w:t>
+            </w:r>
+          </w:p>
+        </w:tc>
+        <w:tc>
+          <w:tcPr/>
+          <w:p>
+            <w:pPr>
+              <w:pStyle w:val="Compact"/>
+            </w:pPr>
+            <w:r>
+              <w:t xml:space="preserve">(0.137)</w:t>
+            </w:r>
+          </w:p>
+        </w:tc>
+        <w:tc>
+          <w:tcPr/>
+          <w:p>
+            <w:pPr>
+              <w:pStyle w:val="Compact"/>
+            </w:pPr>
+            <w:r>
+              <w:t xml:space="preserve">(0.088)</w:t>
             </w:r>
           </w:p>
         </w:tc>
@@ -305,7 +305,51 @@
               <w:pStyle w:val="Compact"/>
             </w:pPr>
             <w:r>
-              <w:t xml:space="preserve">-0.003</w:t>
+              <w:t xml:space="preserve">-0.006</w:t>
+            </w:r>
+          </w:p>
+        </w:tc>
+        <w:tc>
+          <w:tcPr/>
+          <w:p>
+            <w:pPr>
+              <w:pStyle w:val="Compact"/>
+            </w:pPr>
+            <w:r>
+              <w:t xml:space="preserve">-0.007</w:t>
+            </w:r>
+          </w:p>
+        </w:tc>
+        <w:tc>
+          <w:tcPr/>
+          <w:p>
+            <w:pPr>
+              <w:pStyle w:val="Compact"/>
+            </w:pPr>
+            <w:r>
+              <w:t xml:space="preserve">-0.010</w:t>
+            </w:r>
+          </w:p>
+        </w:tc>
+        <w:tc>
+          <w:tcPr/>
+          <w:p>
+            <w:pPr>
+              <w:pStyle w:val="Compact"/>
+            </w:pPr>
+            <w:r>
+              <w:t xml:space="preserve">-0.007</w:t>
+            </w:r>
+          </w:p>
+        </w:tc>
+        <w:tc>
+          <w:tcPr/>
+          <w:p>
+            <w:pPr>
+              <w:pStyle w:val="Compact"/>
+            </w:pPr>
+            <w:r>
+              <w:t xml:space="preserve">0.001</w:t>
             </w:r>
           </w:p>
         </w:tc>
@@ -327,51 +371,7 @@
               <w:pStyle w:val="Compact"/>
             </w:pPr>
             <w:r>
-              <w:t xml:space="preserve">-0.005</w:t>
-            </w:r>
-          </w:p>
-        </w:tc>
-        <w:tc>
-          <w:tcPr/>
-          <w:p>
-            <w:pPr>
-              <w:pStyle w:val="Compact"/>
-            </w:pPr>
-            <w:r>
-              <w:t xml:space="preserve">-0.005</w:t>
-            </w:r>
-          </w:p>
-        </w:tc>
-        <w:tc>
-          <w:tcPr/>
-          <w:p>
-            <w:pPr>
-              <w:pStyle w:val="Compact"/>
-            </w:pPr>
-            <w:r>
-              <w:t xml:space="preserve">-0.001</w:t>
-            </w:r>
-          </w:p>
-        </w:tc>
-        <w:tc>
-          <w:tcPr/>
-          <w:p>
-            <w:pPr>
-              <w:pStyle w:val="Compact"/>
-            </w:pPr>
-            <w:r>
-              <w:t xml:space="preserve">-0.002</w:t>
-            </w:r>
-          </w:p>
-        </w:tc>
-        <w:tc>
-          <w:tcPr/>
-          <w:p>
-            <w:pPr>
-              <w:pStyle w:val="Compact"/>
-            </w:pPr>
-            <w:r>
-              <w:t xml:space="preserve">0.001</w:t>
+              <w:t xml:space="preserve">-0.011</w:t>
             </w:r>
           </w:p>
         </w:tc>
@@ -403,6 +403,39 @@
               <w:pStyle w:val="Compact"/>
             </w:pPr>
             <w:r>
+              <w:t xml:space="preserve">(0.004)</w:t>
+            </w:r>
+          </w:p>
+        </w:tc>
+        <w:tc>
+          <w:tcPr/>
+          <w:p>
+            <w:pPr>
+              <w:pStyle w:val="Compact"/>
+            </w:pPr>
+            <w:r>
+              <w:t xml:space="preserve">(0.004)</w:t>
+            </w:r>
+          </w:p>
+        </w:tc>
+        <w:tc>
+          <w:tcPr/>
+          <w:p>
+            <w:pPr>
+              <w:pStyle w:val="Compact"/>
+            </w:pPr>
+            <w:r>
+              <w:t xml:space="preserve">(0.006)</w:t>
+            </w:r>
+          </w:p>
+        </w:tc>
+        <w:tc>
+          <w:tcPr/>
+          <w:p>
+            <w:pPr>
+              <w:pStyle w:val="Compact"/>
+            </w:pPr>
+            <w:r>
               <w:t xml:space="preserve">(0.003)</w:t>
             </w:r>
           </w:p>
@@ -414,51 +447,18 @@
               <w:pStyle w:val="Compact"/>
             </w:pPr>
             <w:r>
-              <w:t xml:space="preserve">(0.003)</w:t>
-            </w:r>
-          </w:p>
-        </w:tc>
-        <w:tc>
-          <w:tcPr/>
-          <w:p>
-            <w:pPr>
-              <w:pStyle w:val="Compact"/>
-            </w:pPr>
-            <w:r>
-              <w:t xml:space="preserve">(0.004)</w:t>
-            </w:r>
-          </w:p>
-        </w:tc>
-        <w:tc>
-          <w:tcPr/>
-          <w:p>
-            <w:pPr>
-              <w:pStyle w:val="Compact"/>
-            </w:pPr>
-            <w:r>
-              <w:t xml:space="preserve">(0.004)</w:t>
-            </w:r>
-          </w:p>
-        </w:tc>
-        <w:tc>
-          <w:tcPr/>
-          <w:p>
-            <w:pPr>
-              <w:pStyle w:val="Compact"/>
-            </w:pPr>
-            <w:r>
-              <w:t xml:space="preserve">(0.004)</w:t>
-            </w:r>
-          </w:p>
-        </w:tc>
-        <w:tc>
-          <w:tcPr/>
-          <w:p>
-            <w:pPr>
-              <w:pStyle w:val="Compact"/>
-            </w:pPr>
-            <w:r>
-              <w:t xml:space="preserve">(0.004)</w:t>
+              <w:t xml:space="preserve">(0.006)</w:t>
+            </w:r>
+          </w:p>
+        </w:tc>
+        <w:tc>
+          <w:tcPr/>
+          <w:p>
+            <w:pPr>
+              <w:pStyle w:val="Compact"/>
+            </w:pPr>
+            <w:r>
+              <w:t xml:space="preserve">(0.007)</w:t>
             </w:r>
           </w:p>
         </w:tc>
@@ -482,18 +482,18 @@
               <w:pStyle w:val="Compact"/>
             </w:pPr>
             <w:r>
-              <w:t xml:space="preserve">0.257</w:t>
-            </w:r>
-          </w:p>
-        </w:tc>
-        <w:tc>
-          <w:tcPr/>
-          <w:p>
-            <w:pPr>
-              <w:pStyle w:val="Compact"/>
-            </w:pPr>
-            <w:r>
-              <w:t xml:space="preserve">0.256</w:t>
+              <w:t xml:space="preserve">0.236</w:t>
+            </w:r>
+          </w:p>
+        </w:tc>
+        <w:tc>
+          <w:tcPr/>
+          <w:p>
+            <w:pPr>
+              <w:pStyle w:val="Compact"/>
+            </w:pPr>
+            <w:r>
+              <w:t xml:space="preserve">0.215</w:t>
             </w:r>
           </w:p>
         </w:tc>
@@ -554,18 +554,18 @@
               <w:pStyle w:val="Compact"/>
             </w:pPr>
             <w:r>
-              <w:t xml:space="preserve">(0.016)</w:t>
-            </w:r>
-          </w:p>
-        </w:tc>
-        <w:tc>
-          <w:tcPr/>
-          <w:p>
-            <w:pPr>
-              <w:pStyle w:val="Compact"/>
-            </w:pPr>
-            <w:r>
-              <w:t xml:space="preserve">(0.030)</w:t>
+              <w:t xml:space="preserve">(0.024)</w:t>
+            </w:r>
+          </w:p>
+        </w:tc>
+        <w:tc>
+          <w:tcPr/>
+          <w:p>
+            <w:pPr>
+              <w:pStyle w:val="Compact"/>
+            </w:pPr>
+            <w:r>
+              <w:t xml:space="preserve">(0.043)</w:t>
             </w:r>
           </w:p>
         </w:tc>
@@ -629,18 +629,18 @@
               <w:pStyle w:val="Compact"/>
             </w:pPr>
             <w:r>
-              <w:t xml:space="preserve">0.397</w:t>
-            </w:r>
-          </w:p>
-        </w:tc>
-        <w:tc>
-          <w:tcPr/>
-          <w:p>
-            <w:pPr>
-              <w:pStyle w:val="Compact"/>
-            </w:pPr>
-            <w:r>
-              <w:t xml:space="preserve">0.364</w:t>
+              <w:t xml:space="preserve">0.392</w:t>
+            </w:r>
+          </w:p>
+        </w:tc>
+        <w:tc>
+          <w:tcPr/>
+          <w:p>
+            <w:pPr>
+              <w:pStyle w:val="Compact"/>
+            </w:pPr>
+            <w:r>
+              <w:t xml:space="preserve">0.356</w:t>
             </w:r>
           </w:p>
         </w:tc>
@@ -701,18 +701,18 @@
               <w:pStyle w:val="Compact"/>
             </w:pPr>
             <w:r>
-              <w:t xml:space="preserve">(0.023)</w:t>
-            </w:r>
-          </w:p>
-        </w:tc>
-        <w:tc>
-          <w:tcPr/>
-          <w:p>
-            <w:pPr>
-              <w:pStyle w:val="Compact"/>
-            </w:pPr>
-            <w:r>
-              <w:t xml:space="preserve">(0.046)</w:t>
+              <w:t xml:space="preserve">(0.028)</w:t>
+            </w:r>
+          </w:p>
+        </w:tc>
+        <w:tc>
+          <w:tcPr/>
+          <w:p>
+            <w:pPr>
+              <w:pStyle w:val="Compact"/>
+            </w:pPr>
+            <w:r>
+              <w:t xml:space="preserve">(0.053)</w:t>
             </w:r>
           </w:p>
         </w:tc>
@@ -776,18 +776,18 @@
               <w:pStyle w:val="Compact"/>
             </w:pPr>
             <w:r>
-              <w:t xml:space="preserve">0.581</w:t>
-            </w:r>
-          </w:p>
-        </w:tc>
-        <w:tc>
-          <w:tcPr/>
-          <w:p>
-            <w:pPr>
-              <w:pStyle w:val="Compact"/>
-            </w:pPr>
-            <w:r>
-              <w:t xml:space="preserve">0.558</w:t>
+              <w:t xml:space="preserve">0.531</w:t>
+            </w:r>
+          </w:p>
+        </w:tc>
+        <w:tc>
+          <w:tcPr/>
+          <w:p>
+            <w:pPr>
+              <w:pStyle w:val="Compact"/>
+            </w:pPr>
+            <w:r>
+              <w:t xml:space="preserve">0.519</w:t>
             </w:r>
           </w:p>
         </w:tc>
@@ -848,18 +848,18 @@
               <w:pStyle w:val="Compact"/>
             </w:pPr>
             <w:r>
-              <w:t xml:space="preserve">(0.024)</w:t>
-            </w:r>
-          </w:p>
-        </w:tc>
-        <w:tc>
-          <w:tcPr/>
-          <w:p>
-            <w:pPr>
-              <w:pStyle w:val="Compact"/>
-            </w:pPr>
-            <w:r>
-              <w:t xml:space="preserve">(0.051)</w:t>
+              <w:t xml:space="preserve">(0.025)</w:t>
+            </w:r>
+          </w:p>
+        </w:tc>
+        <w:tc>
+          <w:tcPr/>
+          <w:p>
+            <w:pPr>
+              <w:pStyle w:val="Compact"/>
+            </w:pPr>
+            <w:r>
+              <w:t xml:space="preserve">(0.048)</w:t>
             </w:r>
           </w:p>
         </w:tc>
@@ -923,18 +923,18 @@
               <w:pStyle w:val="Compact"/>
             </w:pPr>
             <w:r>
-              <w:t xml:space="preserve">0.983</w:t>
-            </w:r>
-          </w:p>
-        </w:tc>
-        <w:tc>
-          <w:tcPr/>
-          <w:p>
-            <w:pPr>
-              <w:pStyle w:val="Compact"/>
-            </w:pPr>
-            <w:r>
-              <w:t xml:space="preserve">0.998</w:t>
+              <w:t xml:space="preserve">0.850</w:t>
+            </w:r>
+          </w:p>
+        </w:tc>
+        <w:tc>
+          <w:tcPr/>
+          <w:p>
+            <w:pPr>
+              <w:pStyle w:val="Compact"/>
+            </w:pPr>
+            <w:r>
+              <w:t xml:space="preserve">0.849</w:t>
             </w:r>
           </w:p>
         </w:tc>
@@ -995,18 +995,18 @@
               <w:pStyle w:val="Compact"/>
             </w:pPr>
             <w:r>
-              <w:t xml:space="preserve">(0.036)</w:t>
-            </w:r>
-          </w:p>
-        </w:tc>
-        <w:tc>
-          <w:tcPr/>
-          <w:p>
-            <w:pPr>
-              <w:pStyle w:val="Compact"/>
-            </w:pPr>
-            <w:r>
-              <w:t xml:space="preserve">(0.063)</w:t>
+              <w:t xml:space="preserve">(0.039)</w:t>
+            </w:r>
+          </w:p>
+        </w:tc>
+        <w:tc>
+          <w:tcPr/>
+          <w:p>
+            <w:pPr>
+              <w:pStyle w:val="Compact"/>
+            </w:pPr>
+            <w:r>
+              <w:t xml:space="preserve">(0.081)</w:t>
             </w:r>
           </w:p>
         </w:tc>
@@ -1070,73 +1070,73 @@
               <w:pStyle w:val="Compact"/>
             </w:pPr>
             <w:r>
-              <w:t xml:space="preserve">-0.125</w:t>
-            </w:r>
-          </w:p>
-        </w:tc>
-        <w:tc>
-          <w:tcPr/>
-          <w:p>
-            <w:pPr>
-              <w:pStyle w:val="Compact"/>
-            </w:pPr>
-            <w:r>
-              <w:t xml:space="preserve">-0.124</w:t>
-            </w:r>
-          </w:p>
-        </w:tc>
-        <w:tc>
-          <w:tcPr/>
-          <w:p>
-            <w:pPr>
-              <w:pStyle w:val="Compact"/>
-            </w:pPr>
-            <w:r>
-              <w:t xml:space="preserve">-0.049</w:t>
-            </w:r>
-          </w:p>
-        </w:tc>
-        <w:tc>
-          <w:tcPr/>
-          <w:p>
-            <w:pPr>
-              <w:pStyle w:val="Compact"/>
-            </w:pPr>
-            <w:r>
-              <w:t xml:space="preserve">-0.050</w:t>
-            </w:r>
-          </w:p>
-        </w:tc>
-        <w:tc>
-          <w:tcPr/>
-          <w:p>
-            <w:pPr>
-              <w:pStyle w:val="Compact"/>
-            </w:pPr>
-            <w:r>
-              <w:t xml:space="preserve">-0.043</w:t>
-            </w:r>
-          </w:p>
-        </w:tc>
-        <w:tc>
-          <w:tcPr/>
-          <w:p>
-            <w:pPr>
-              <w:pStyle w:val="Compact"/>
-            </w:pPr>
-            <w:r>
-              <w:t xml:space="preserve">-0.118</w:t>
-            </w:r>
-          </w:p>
-        </w:tc>
-        <w:tc>
-          <w:tcPr/>
-          <w:p>
-            <w:pPr>
-              <w:pStyle w:val="Compact"/>
-            </w:pPr>
-            <w:r>
-              <w:t xml:space="preserve">-0.274</w:t>
+              <w:t xml:space="preserve">-0.158</w:t>
+            </w:r>
+          </w:p>
+        </w:tc>
+        <w:tc>
+          <w:tcPr/>
+          <w:p>
+            <w:pPr>
+              <w:pStyle w:val="Compact"/>
+            </w:pPr>
+            <w:r>
+              <w:t xml:space="preserve">-0.157</w:t>
+            </w:r>
+          </w:p>
+        </w:tc>
+        <w:tc>
+          <w:tcPr/>
+          <w:p>
+            <w:pPr>
+              <w:pStyle w:val="Compact"/>
+            </w:pPr>
+            <w:r>
+              <w:t xml:space="preserve">-0.127</w:t>
+            </w:r>
+          </w:p>
+        </w:tc>
+        <w:tc>
+          <w:tcPr/>
+          <w:p>
+            <w:pPr>
+              <w:pStyle w:val="Compact"/>
+            </w:pPr>
+            <w:r>
+              <w:t xml:space="preserve">-0.099</w:t>
+            </w:r>
+          </w:p>
+        </w:tc>
+        <w:tc>
+          <w:tcPr/>
+          <w:p>
+            <w:pPr>
+              <w:pStyle w:val="Compact"/>
+            </w:pPr>
+            <w:r>
+              <w:t xml:space="preserve">-0.064</w:t>
+            </w:r>
+          </w:p>
+        </w:tc>
+        <w:tc>
+          <w:tcPr/>
+          <w:p>
+            <w:pPr>
+              <w:pStyle w:val="Compact"/>
+            </w:pPr>
+            <w:r>
+              <w:t xml:space="preserve">-0.239</w:t>
+            </w:r>
+          </w:p>
+        </w:tc>
+        <w:tc>
+          <w:tcPr/>
+          <w:p>
+            <w:pPr>
+              <w:pStyle w:val="Compact"/>
+            </w:pPr>
+            <w:r>
+              <w:t xml:space="preserve">-0.179</w:t>
             </w:r>
           </w:p>
         </w:tc>
@@ -1157,73 +1157,73 @@
               <w:pStyle w:val="Compact"/>
             </w:pPr>
             <w:r>
-              <w:t xml:space="preserve">(0.019)</w:t>
-            </w:r>
-          </w:p>
-        </w:tc>
-        <w:tc>
-          <w:tcPr/>
-          <w:p>
-            <w:pPr>
-              <w:pStyle w:val="Compact"/>
-            </w:pPr>
-            <w:r>
-              <w:t xml:space="preserve">(0.019)</w:t>
-            </w:r>
-          </w:p>
-        </w:tc>
-        <w:tc>
-          <w:tcPr/>
-          <w:p>
-            <w:pPr>
-              <w:pStyle w:val="Compact"/>
-            </w:pPr>
-            <w:r>
-              <w:t xml:space="preserve">(0.033)</w:t>
-            </w:r>
-          </w:p>
-        </w:tc>
-        <w:tc>
-          <w:tcPr/>
-          <w:p>
-            <w:pPr>
-              <w:pStyle w:val="Compact"/>
-            </w:pPr>
-            <w:r>
-              <w:t xml:space="preserve">(0.032)</w:t>
-            </w:r>
-          </w:p>
-        </w:tc>
-        <w:tc>
-          <w:tcPr/>
-          <w:p>
-            <w:pPr>
-              <w:pStyle w:val="Compact"/>
-            </w:pPr>
-            <w:r>
-              <w:t xml:space="preserve">(0.033)</w:t>
-            </w:r>
-          </w:p>
-        </w:tc>
-        <w:tc>
-          <w:tcPr/>
-          <w:p>
-            <w:pPr>
-              <w:pStyle w:val="Compact"/>
-            </w:pPr>
-            <w:r>
-              <w:t xml:space="preserve">(0.028)</w:t>
-            </w:r>
-          </w:p>
-        </w:tc>
-        <w:tc>
-          <w:tcPr/>
-          <w:p>
-            <w:pPr>
-              <w:pStyle w:val="Compact"/>
-            </w:pPr>
-            <w:r>
-              <w:t xml:space="preserve">(0.049)</w:t>
+              <w:t xml:space="preserve">(0.024)</w:t>
+            </w:r>
+          </w:p>
+        </w:tc>
+        <w:tc>
+          <w:tcPr/>
+          <w:p>
+            <w:pPr>
+              <w:pStyle w:val="Compact"/>
+            </w:pPr>
+            <w:r>
+              <w:t xml:space="preserve">(0.024)</w:t>
+            </w:r>
+          </w:p>
+        </w:tc>
+        <w:tc>
+          <w:tcPr/>
+          <w:p>
+            <w:pPr>
+              <w:pStyle w:val="Compact"/>
+            </w:pPr>
+            <w:r>
+              <w:t xml:space="preserve">(0.087)</w:t>
+            </w:r>
+          </w:p>
+        </w:tc>
+        <w:tc>
+          <w:tcPr/>
+          <w:p>
+            <w:pPr>
+              <w:pStyle w:val="Compact"/>
+            </w:pPr>
+            <w:r>
+              <w:t xml:space="preserve">(0.053)</w:t>
+            </w:r>
+          </w:p>
+        </w:tc>
+        <w:tc>
+          <w:tcPr/>
+          <w:p>
+            <w:pPr>
+              <w:pStyle w:val="Compact"/>
+            </w:pPr>
+            <w:r>
+              <w:t xml:space="preserve">(0.060)</w:t>
+            </w:r>
+          </w:p>
+        </w:tc>
+        <w:tc>
+          <w:tcPr/>
+          <w:p>
+            <w:pPr>
+              <w:pStyle w:val="Compact"/>
+            </w:pPr>
+            <w:r>
+              <w:t xml:space="preserve">(0.058)</w:t>
+            </w:r>
+          </w:p>
+        </w:tc>
+        <w:tc>
+          <w:tcPr/>
+          <w:p>
+            <w:pPr>
+              <w:pStyle w:val="Compact"/>
+            </w:pPr>
+            <w:r>
+              <w:t xml:space="preserve">(0.068)</w:t>
             </w:r>
           </w:p>
         </w:tc>
@@ -1247,73 +1247,73 @@
               <w:pStyle w:val="Compact"/>
             </w:pPr>
             <w:r>
-              <w:t xml:space="preserve">-0.225</w:t>
-            </w:r>
-          </w:p>
-        </w:tc>
-        <w:tc>
-          <w:tcPr/>
-          <w:p>
-            <w:pPr>
-              <w:pStyle w:val="Compact"/>
-            </w:pPr>
-            <w:r>
-              <w:t xml:space="preserve">-0.221</w:t>
-            </w:r>
-          </w:p>
-        </w:tc>
-        <w:tc>
-          <w:tcPr/>
-          <w:p>
-            <w:pPr>
-              <w:pStyle w:val="Compact"/>
-            </w:pPr>
-            <w:r>
-              <w:t xml:space="preserve">-0.176</w:t>
-            </w:r>
-          </w:p>
-        </w:tc>
-        <w:tc>
-          <w:tcPr/>
-          <w:p>
-            <w:pPr>
-              <w:pStyle w:val="Compact"/>
-            </w:pPr>
-            <w:r>
-              <w:t xml:space="preserve">-0.144</w:t>
-            </w:r>
-          </w:p>
-        </w:tc>
-        <w:tc>
-          <w:tcPr/>
-          <w:p>
-            <w:pPr>
-              <w:pStyle w:val="Compact"/>
-            </w:pPr>
-            <w:r>
-              <w:t xml:space="preserve">-0.161</w:t>
-            </w:r>
-          </w:p>
-        </w:tc>
-        <w:tc>
-          <w:tcPr/>
-          <w:p>
-            <w:pPr>
-              <w:pStyle w:val="Compact"/>
-            </w:pPr>
-            <w:r>
-              <w:t xml:space="preserve">-0.134</w:t>
-            </w:r>
-          </w:p>
-        </w:tc>
-        <w:tc>
-          <w:tcPr/>
-          <w:p>
-            <w:pPr>
-              <w:pStyle w:val="Compact"/>
-            </w:pPr>
-            <w:r>
-              <w:t xml:space="preserve">-0.254</w:t>
+              <w:t xml:space="preserve">-0.245</w:t>
+            </w:r>
+          </w:p>
+        </w:tc>
+        <w:tc>
+          <w:tcPr/>
+          <w:p>
+            <w:pPr>
+              <w:pStyle w:val="Compact"/>
+            </w:pPr>
+            <w:r>
+              <w:t xml:space="preserve">-0.245</w:t>
+            </w:r>
+          </w:p>
+        </w:tc>
+        <w:tc>
+          <w:tcPr/>
+          <w:p>
+            <w:pPr>
+              <w:pStyle w:val="Compact"/>
+            </w:pPr>
+            <w:r>
+              <w:t xml:space="preserve">-0.111</w:t>
+            </w:r>
+          </w:p>
+        </w:tc>
+        <w:tc>
+          <w:tcPr/>
+          <w:p>
+            <w:pPr>
+              <w:pStyle w:val="Compact"/>
+            </w:pPr>
+            <w:r>
+              <w:t xml:space="preserve">-1.015</w:t>
+            </w:r>
+          </w:p>
+        </w:tc>
+        <w:tc>
+          <w:tcPr/>
+          <w:p>
+            <w:pPr>
+              <w:pStyle w:val="Compact"/>
+            </w:pPr>
+            <w:r>
+              <w:t xml:space="preserve">-0.315</w:t>
+            </w:r>
+          </w:p>
+        </w:tc>
+        <w:tc>
+          <w:tcPr/>
+          <w:p>
+            <w:pPr>
+              <w:pStyle w:val="Compact"/>
+            </w:pPr>
+            <w:r>
+              <w:t xml:space="preserve">-0.281</w:t>
+            </w:r>
+          </w:p>
+        </w:tc>
+        <w:tc>
+          <w:tcPr/>
+          <w:p>
+            <w:pPr>
+              <w:pStyle w:val="Compact"/>
+            </w:pPr>
+            <w:r>
+              <w:t xml:space="preserve">-0.217</w:t>
             </w:r>
           </w:p>
         </w:tc>
@@ -1334,73 +1334,73 @@
               <w:pStyle w:val="Compact"/>
             </w:pPr>
             <w:r>
-              <w:t xml:space="preserve">(0.036)</w:t>
-            </w:r>
-          </w:p>
-        </w:tc>
-        <w:tc>
-          <w:tcPr/>
-          <w:p>
-            <w:pPr>
-              <w:pStyle w:val="Compact"/>
-            </w:pPr>
-            <w:r>
-              <w:t xml:space="preserve">(0.040)</w:t>
-            </w:r>
-          </w:p>
-        </w:tc>
-        <w:tc>
-          <w:tcPr/>
-          <w:p>
-            <w:pPr>
-              <w:pStyle w:val="Compact"/>
-            </w:pPr>
-            <w:r>
-              <w:t xml:space="preserve">(0.070)</w:t>
-            </w:r>
-          </w:p>
-        </w:tc>
-        <w:tc>
-          <w:tcPr/>
-          <w:p>
-            <w:pPr>
-              <w:pStyle w:val="Compact"/>
-            </w:pPr>
-            <w:r>
-              <w:t xml:space="preserve">(0.071)</w:t>
-            </w:r>
-          </w:p>
-        </w:tc>
-        <w:tc>
-          <w:tcPr/>
-          <w:p>
-            <w:pPr>
-              <w:pStyle w:val="Compact"/>
-            </w:pPr>
-            <w:r>
-              <w:t xml:space="preserve">(0.059)</w:t>
-            </w:r>
-          </w:p>
-        </w:tc>
-        <w:tc>
-          <w:tcPr/>
-          <w:p>
-            <w:pPr>
-              <w:pStyle w:val="Compact"/>
-            </w:pPr>
-            <w:r>
-              <w:t xml:space="preserve">(0.081)</w:t>
-            </w:r>
-          </w:p>
-        </w:tc>
-        <w:tc>
-          <w:tcPr/>
-          <w:p>
-            <w:pPr>
-              <w:pStyle w:val="Compact"/>
-            </w:pPr>
-            <w:r>
-              <w:t xml:space="preserve">(0.059)</w:t>
+              <w:t xml:space="preserve">(0.118)</w:t>
+            </w:r>
+          </w:p>
+        </w:tc>
+        <w:tc>
+          <w:tcPr/>
+          <w:p>
+            <w:pPr>
+              <w:pStyle w:val="Compact"/>
+            </w:pPr>
+            <w:r>
+              <w:t xml:space="preserve">(0.118)</w:t>
+            </w:r>
+          </w:p>
+        </w:tc>
+        <w:tc>
+          <w:tcPr/>
+          <w:p>
+            <w:pPr>
+              <w:pStyle w:val="Compact"/>
+            </w:pPr>
+            <w:r>
+              <w:t xml:space="preserve">(0.452)</w:t>
+            </w:r>
+          </w:p>
+        </w:tc>
+        <w:tc>
+          <w:tcPr/>
+          <w:p>
+            <w:pPr>
+              <w:pStyle w:val="Compact"/>
+            </w:pPr>
+            <w:r>
+              <w:t xml:space="preserve">(0.048)</w:t>
+            </w:r>
+          </w:p>
+        </w:tc>
+        <w:tc>
+          <w:tcPr/>
+          <w:p>
+            <w:pPr>
+              <w:pStyle w:val="Compact"/>
+            </w:pPr>
+            <w:r>
+              <w:t xml:space="preserve">(0.132)</w:t>
+            </w:r>
+          </w:p>
+        </w:tc>
+        <w:tc>
+          <w:tcPr/>
+          <w:p>
+            <w:pPr>
+              <w:pStyle w:val="Compact"/>
+            </w:pPr>
+            <w:r>
+              <w:t xml:space="preserve">(0.125)</w:t>
+            </w:r>
+          </w:p>
+        </w:tc>
+        <w:tc>
+          <w:tcPr/>
+          <w:p>
+            <w:pPr>
+              <w:pStyle w:val="Compact"/>
+            </w:pPr>
+            <w:r>
+              <w:t xml:space="preserve">(0.076)</w:t>
             </w:r>
           </w:p>
         </w:tc>
@@ -1424,73 +1424,73 @@
               <w:pStyle w:val="Compact"/>
             </w:pPr>
             <w:r>
-              <w:t xml:space="preserve">-0.145</w:t>
-            </w:r>
-          </w:p>
-        </w:tc>
-        <w:tc>
-          <w:tcPr/>
-          <w:p>
-            <w:pPr>
-              <w:pStyle w:val="Compact"/>
-            </w:pPr>
-            <w:r>
-              <w:t xml:space="preserve">-0.140</w:t>
-            </w:r>
-          </w:p>
-        </w:tc>
-        <w:tc>
-          <w:tcPr/>
-          <w:p>
-            <w:pPr>
-              <w:pStyle w:val="Compact"/>
-            </w:pPr>
-            <w:r>
-              <w:t xml:space="preserve">-0.113</w:t>
-            </w:r>
-          </w:p>
-        </w:tc>
-        <w:tc>
-          <w:tcPr/>
-          <w:p>
-            <w:pPr>
-              <w:pStyle w:val="Compact"/>
-            </w:pPr>
-            <w:r>
-              <w:t xml:space="preserve">-0.023</w:t>
-            </w:r>
-          </w:p>
-        </w:tc>
-        <w:tc>
-          <w:tcPr/>
-          <w:p>
-            <w:pPr>
-              <w:pStyle w:val="Compact"/>
-            </w:pPr>
-            <w:r>
-              <w:t xml:space="preserve">-0.063</w:t>
-            </w:r>
-          </w:p>
-        </w:tc>
-        <w:tc>
-          <w:tcPr/>
-          <w:p>
-            <w:pPr>
-              <w:pStyle w:val="Compact"/>
-            </w:pPr>
-            <w:r>
-              <w:t xml:space="preserve">-0.051</w:t>
-            </w:r>
-          </w:p>
-        </w:tc>
-        <w:tc>
-          <w:tcPr/>
-          <w:p>
-            <w:pPr>
-              <w:pStyle w:val="Compact"/>
-            </w:pPr>
-            <w:r>
-              <w:t xml:space="preserve">-0.242</w:t>
+              <w:t xml:space="preserve">-0.213</w:t>
+            </w:r>
+          </w:p>
+        </w:tc>
+        <w:tc>
+          <w:tcPr/>
+          <w:p>
+            <w:pPr>
+              <w:pStyle w:val="Compact"/>
+            </w:pPr>
+            <w:r>
+              <w:t xml:space="preserve">-0.213</w:t>
+            </w:r>
+          </w:p>
+        </w:tc>
+        <w:tc>
+          <w:tcPr/>
+          <w:p>
+            <w:pPr>
+              <w:pStyle w:val="Compact"/>
+            </w:pPr>
+            <w:r>
+              <w:t xml:space="preserve">-0.126</w:t>
+            </w:r>
+          </w:p>
+        </w:tc>
+        <w:tc>
+          <w:tcPr/>
+          <w:p>
+            <w:pPr>
+              <w:pStyle w:val="Compact"/>
+            </w:pPr>
+            <w:r>
+              <w:t xml:space="preserve">-0.963</w:t>
+            </w:r>
+          </w:p>
+        </w:tc>
+        <w:tc>
+          <w:tcPr/>
+          <w:p>
+            <w:pPr>
+              <w:pStyle w:val="Compact"/>
+            </w:pPr>
+            <w:r>
+              <w:t xml:space="preserve">-0.282</w:t>
+            </w:r>
+          </w:p>
+        </w:tc>
+        <w:tc>
+          <w:tcPr/>
+          <w:p>
+            <w:pPr>
+              <w:pStyle w:val="Compact"/>
+            </w:pPr>
+            <w:r>
+              <w:t xml:space="preserve">-0.264</w:t>
+            </w:r>
+          </w:p>
+        </w:tc>
+        <w:tc>
+          <w:tcPr/>
+          <w:p>
+            <w:pPr>
+              <w:pStyle w:val="Compact"/>
+            </w:pPr>
+            <w:r>
+              <w:t xml:space="preserve">-0.088</w:t>
             </w:r>
           </w:p>
         </w:tc>
@@ -1511,73 +1511,73 @@
               <w:pStyle w:val="Compact"/>
             </w:pPr>
             <w:r>
-              <w:t xml:space="preserve">(0.038)</w:t>
-            </w:r>
-          </w:p>
-        </w:tc>
-        <w:tc>
-          <w:tcPr/>
-          <w:p>
-            <w:pPr>
-              <w:pStyle w:val="Compact"/>
-            </w:pPr>
-            <w:r>
-              <w:t xml:space="preserve">(0.044)</w:t>
-            </w:r>
-          </w:p>
-        </w:tc>
-        <w:tc>
-          <w:tcPr/>
-          <w:p>
-            <w:pPr>
-              <w:pStyle w:val="Compact"/>
-            </w:pPr>
-            <w:r>
-              <w:t xml:space="preserve">(0.059)</w:t>
-            </w:r>
-          </w:p>
-        </w:tc>
-        <w:tc>
-          <w:tcPr/>
-          <w:p>
-            <w:pPr>
-              <w:pStyle w:val="Compact"/>
-            </w:pPr>
-            <w:r>
-              <w:t xml:space="preserve">(0.065)</w:t>
-            </w:r>
-          </w:p>
-        </w:tc>
-        <w:tc>
-          <w:tcPr/>
-          <w:p>
-            <w:pPr>
-              <w:pStyle w:val="Compact"/>
-            </w:pPr>
-            <w:r>
-              <w:t xml:space="preserve">(0.058)</w:t>
-            </w:r>
-          </w:p>
-        </w:tc>
-        <w:tc>
-          <w:tcPr/>
-          <w:p>
-            <w:pPr>
-              <w:pStyle w:val="Compact"/>
-            </w:pPr>
-            <w:r>
-              <w:t xml:space="preserve">(0.088)</w:t>
-            </w:r>
-          </w:p>
-        </w:tc>
-        <w:tc>
-          <w:tcPr/>
-          <w:p>
-            <w:pPr>
-              <w:pStyle w:val="Compact"/>
-            </w:pPr>
-            <w:r>
-              <w:t xml:space="preserve">(0.039)</w:t>
+              <w:t xml:space="preserve">(0.120)</w:t>
+            </w:r>
+          </w:p>
+        </w:tc>
+        <w:tc>
+          <w:tcPr/>
+          <w:p>
+            <w:pPr>
+              <w:pStyle w:val="Compact"/>
+            </w:pPr>
+            <w:r>
+              <w:t xml:space="preserve">(0.121)</w:t>
+            </w:r>
+          </w:p>
+        </w:tc>
+        <w:tc>
+          <w:tcPr/>
+          <w:p>
+            <w:pPr>
+              <w:pStyle w:val="Compact"/>
+            </w:pPr>
+            <w:r>
+              <w:t xml:space="preserve">(0.453)</w:t>
+            </w:r>
+          </w:p>
+        </w:tc>
+        <w:tc>
+          <w:tcPr/>
+          <w:p>
+            <w:pPr>
+              <w:pStyle w:val="Compact"/>
+            </w:pPr>
+            <w:r>
+              <w:t xml:space="preserve">(0.054)</w:t>
+            </w:r>
+          </w:p>
+        </w:tc>
+        <w:tc>
+          <w:tcPr/>
+          <w:p>
+            <w:pPr>
+              <w:pStyle w:val="Compact"/>
+            </w:pPr>
+            <w:r>
+              <w:t xml:space="preserve">(0.129)</w:t>
+            </w:r>
+          </w:p>
+        </w:tc>
+        <w:tc>
+          <w:tcPr/>
+          <w:p>
+            <w:pPr>
+              <w:pStyle w:val="Compact"/>
+            </w:pPr>
+            <w:r>
+              <w:t xml:space="preserve">(0.129)</w:t>
+            </w:r>
+          </w:p>
+        </w:tc>
+        <w:tc>
+          <w:tcPr/>
+          <w:p>
+            <w:pPr>
+              <w:pStyle w:val="Compact"/>
+            </w:pPr>
+            <w:r>
+              <w:t xml:space="preserve">(0.091)</w:t>
             </w:r>
           </w:p>
         </w:tc>
@@ -1601,73 +1601,73 @@
               <w:pStyle w:val="Compact"/>
             </w:pPr>
             <w:r>
-              <w:t xml:space="preserve">-0.126</w:t>
-            </w:r>
-          </w:p>
-        </w:tc>
-        <w:tc>
-          <w:tcPr/>
-          <w:p>
-            <w:pPr>
-              <w:pStyle w:val="Compact"/>
-            </w:pPr>
-            <w:r>
-              <w:t xml:space="preserve">-0.120</w:t>
-            </w:r>
-          </w:p>
-        </w:tc>
-        <w:tc>
-          <w:tcPr/>
-          <w:p>
-            <w:pPr>
-              <w:pStyle w:val="Compact"/>
-            </w:pPr>
-            <w:r>
-              <w:t xml:space="preserve">-0.131</w:t>
-            </w:r>
-          </w:p>
-        </w:tc>
-        <w:tc>
-          <w:tcPr/>
-          <w:p>
-            <w:pPr>
-              <w:pStyle w:val="Compact"/>
-            </w:pPr>
-            <w:r>
-              <w:t xml:space="preserve">-0.050</w:t>
-            </w:r>
-          </w:p>
-        </w:tc>
-        <w:tc>
-          <w:tcPr/>
-          <w:p>
-            <w:pPr>
-              <w:pStyle w:val="Compact"/>
-            </w:pPr>
-            <w:r>
-              <w:t xml:space="preserve">-0.055</w:t>
-            </w:r>
-          </w:p>
-        </w:tc>
-        <w:tc>
-          <w:tcPr/>
-          <w:p>
-            <w:pPr>
-              <w:pStyle w:val="Compact"/>
-            </w:pPr>
-            <w:r>
-              <w:t xml:space="preserve">-0.013</w:t>
-            </w:r>
-          </w:p>
-        </w:tc>
-        <w:tc>
-          <w:tcPr/>
-          <w:p>
-            <w:pPr>
-              <w:pStyle w:val="Compact"/>
-            </w:pPr>
-            <w:r>
-              <w:t xml:space="preserve">-0.112</w:t>
+              <w:t xml:space="preserve">-0.242</w:t>
+            </w:r>
+          </w:p>
+        </w:tc>
+        <w:tc>
+          <w:tcPr/>
+          <w:p>
+            <w:pPr>
+              <w:pStyle w:val="Compact"/>
+            </w:pPr>
+            <w:r>
+              <w:t xml:space="preserve">-0.241</w:t>
+            </w:r>
+          </w:p>
+        </w:tc>
+        <w:tc>
+          <w:tcPr/>
+          <w:p>
+            <w:pPr>
+              <w:pStyle w:val="Compact"/>
+            </w:pPr>
+            <w:r>
+              <w:t xml:space="preserve">-0.202</w:t>
+            </w:r>
+          </w:p>
+        </w:tc>
+        <w:tc>
+          <w:tcPr/>
+          <w:p>
+            <w:pPr>
+              <w:pStyle w:val="Compact"/>
+            </w:pPr>
+            <w:r>
+              <w:t xml:space="preserve">-1.041</w:t>
+            </w:r>
+          </w:p>
+        </w:tc>
+        <w:tc>
+          <w:tcPr/>
+          <w:p>
+            <w:pPr>
+              <w:pStyle w:val="Compact"/>
+            </w:pPr>
+            <w:r>
+              <w:t xml:space="preserve">-0.271</w:t>
+            </w:r>
+          </w:p>
+        </w:tc>
+        <w:tc>
+          <w:tcPr/>
+          <w:p>
+            <w:pPr>
+              <w:pStyle w:val="Compact"/>
+            </w:pPr>
+            <w:r>
+              <w:t xml:space="preserve">-0.285</w:t>
+            </w:r>
+          </w:p>
+        </w:tc>
+        <w:tc>
+          <w:tcPr/>
+          <w:p>
+            <w:pPr>
+              <w:pStyle w:val="Compact"/>
+            </w:pPr>
+            <w:r>
+              <w:t xml:space="preserve">-0.093</w:t>
             </w:r>
           </w:p>
         </w:tc>
@@ -1688,73 +1688,73 @@
               <w:pStyle w:val="Compact"/>
             </w:pPr>
             <w:r>
-              <w:t xml:space="preserve">(0.034)</w:t>
-            </w:r>
-          </w:p>
-        </w:tc>
-        <w:tc>
-          <w:tcPr/>
-          <w:p>
-            <w:pPr>
-              <w:pStyle w:val="Compact"/>
-            </w:pPr>
-            <w:r>
-              <w:t xml:space="preserve">(0.038)</w:t>
-            </w:r>
-          </w:p>
-        </w:tc>
-        <w:tc>
-          <w:tcPr/>
-          <w:p>
-            <w:pPr>
-              <w:pStyle w:val="Compact"/>
-            </w:pPr>
-            <w:r>
-              <w:t xml:space="preserve">(0.079)</w:t>
-            </w:r>
-          </w:p>
-        </w:tc>
-        <w:tc>
-          <w:tcPr/>
-          <w:p>
-            <w:pPr>
-              <w:pStyle w:val="Compact"/>
-            </w:pPr>
-            <w:r>
-              <w:t xml:space="preserve">(0.066)</w:t>
-            </w:r>
-          </w:p>
-        </w:tc>
-        <w:tc>
-          <w:tcPr/>
-          <w:p>
-            <w:pPr>
-              <w:pStyle w:val="Compact"/>
-            </w:pPr>
-            <w:r>
-              <w:t xml:space="preserve">(0.050)</w:t>
-            </w:r>
-          </w:p>
-        </w:tc>
-        <w:tc>
-          <w:tcPr/>
-          <w:p>
-            <w:pPr>
-              <w:pStyle w:val="Compact"/>
-            </w:pPr>
-            <w:r>
-              <w:t xml:space="preserve">(0.080)</w:t>
-            </w:r>
-          </w:p>
-        </w:tc>
-        <w:tc>
-          <w:tcPr/>
-          <w:p>
-            <w:pPr>
-              <w:pStyle w:val="Compact"/>
-            </w:pPr>
-            <w:r>
-              <w:t xml:space="preserve">(0.074)</w:t>
+              <w:t xml:space="preserve">(0.116)</w:t>
+            </w:r>
+          </w:p>
+        </w:tc>
+        <w:tc>
+          <w:tcPr/>
+          <w:p>
+            <w:pPr>
+              <w:pStyle w:val="Compact"/>
+            </w:pPr>
+            <w:r>
+              <w:t xml:space="preserve">(0.117)</w:t>
+            </w:r>
+          </w:p>
+        </w:tc>
+        <w:tc>
+          <w:tcPr/>
+          <w:p>
+            <w:pPr>
+              <w:pStyle w:val="Compact"/>
+            </w:pPr>
+            <w:r>
+              <w:t xml:space="preserve">(0.453)</w:t>
+            </w:r>
+          </w:p>
+        </w:tc>
+        <w:tc>
+          <w:tcPr/>
+          <w:p>
+            <w:pPr>
+              <w:pStyle w:val="Compact"/>
+            </w:pPr>
+            <w:r>
+              <w:t xml:space="preserve">(0.086)</w:t>
+            </w:r>
+          </w:p>
+        </w:tc>
+        <w:tc>
+          <w:tcPr/>
+          <w:p>
+            <w:pPr>
+              <w:pStyle w:val="Compact"/>
+            </w:pPr>
+            <w:r>
+              <w:t xml:space="preserve">(0.130)</w:t>
+            </w:r>
+          </w:p>
+        </w:tc>
+        <w:tc>
+          <w:tcPr/>
+          <w:p>
+            <w:pPr>
+              <w:pStyle w:val="Compact"/>
+            </w:pPr>
+            <w:r>
+              <w:t xml:space="preserve">(0.126)</w:t>
+            </w:r>
+          </w:p>
+        </w:tc>
+        <w:tc>
+          <w:tcPr/>
+          <w:p>
+            <w:pPr>
+              <w:pStyle w:val="Compact"/>
+            </w:pPr>
+            <w:r>
+              <w:t xml:space="preserve">(0.075)</w:t>
             </w:r>
           </w:p>
         </w:tc>
@@ -1778,17 +1778,6 @@
               <w:pStyle w:val="Compact"/>
             </w:pPr>
             <w:r>
-              <w:t xml:space="preserve">-0.211</w:t>
-            </w:r>
-          </w:p>
-        </w:tc>
-        <w:tc>
-          <w:tcPr/>
-          <w:p>
-            <w:pPr>
-              <w:pStyle w:val="Compact"/>
-            </w:pPr>
-            <w:r>
               <w:t xml:space="preserve">-0.207</w:t>
             </w:r>
           </w:p>
@@ -1800,51 +1789,62 @@
               <w:pStyle w:val="Compact"/>
             </w:pPr>
             <w:r>
-              <w:t xml:space="preserve">-0.144</w:t>
-            </w:r>
-          </w:p>
-        </w:tc>
-        <w:tc>
-          <w:tcPr/>
-          <w:p>
-            <w:pPr>
-              <w:pStyle w:val="Compact"/>
-            </w:pPr>
-            <w:r>
-              <w:t xml:space="preserve">-0.091</w:t>
-            </w:r>
-          </w:p>
-        </w:tc>
-        <w:tc>
-          <w:tcPr/>
-          <w:p>
-            <w:pPr>
-              <w:pStyle w:val="Compact"/>
-            </w:pPr>
-            <w:r>
-              <w:t xml:space="preserve">-0.148</w:t>
-            </w:r>
-          </w:p>
-        </w:tc>
-        <w:tc>
-          <w:tcPr/>
-          <w:p>
-            <w:pPr>
-              <w:pStyle w:val="Compact"/>
-            </w:pPr>
-            <w:r>
-              <w:t xml:space="preserve">-0.116</w:t>
-            </w:r>
-          </w:p>
-        </w:tc>
-        <w:tc>
-          <w:tcPr/>
-          <w:p>
-            <w:pPr>
-              <w:pStyle w:val="Compact"/>
-            </w:pPr>
-            <w:r>
-              <w:t xml:space="preserve">-0.286</w:t>
+              <w:t xml:space="preserve">-0.206</w:t>
+            </w:r>
+          </w:p>
+        </w:tc>
+        <w:tc>
+          <w:tcPr/>
+          <w:p>
+            <w:pPr>
+              <w:pStyle w:val="Compact"/>
+            </w:pPr>
+            <w:r>
+              <w:t xml:space="preserve">-0.045</w:t>
+            </w:r>
+          </w:p>
+        </w:tc>
+        <w:tc>
+          <w:tcPr/>
+          <w:p>
+            <w:pPr>
+              <w:pStyle w:val="Compact"/>
+            </w:pPr>
+            <w:r>
+              <w:t xml:space="preserve">-0.929</w:t>
+            </w:r>
+          </w:p>
+        </w:tc>
+        <w:tc>
+          <w:tcPr/>
+          <w:p>
+            <w:pPr>
+              <w:pStyle w:val="Compact"/>
+            </w:pPr>
+            <w:r>
+              <w:t xml:space="preserve">-0.365</w:t>
+            </w:r>
+          </w:p>
+        </w:tc>
+        <w:tc>
+          <w:tcPr/>
+          <w:p>
+            <w:pPr>
+              <w:pStyle w:val="Compact"/>
+            </w:pPr>
+            <w:r>
+              <w:t xml:space="preserve">-0.301</w:t>
+            </w:r>
+          </w:p>
+        </w:tc>
+        <w:tc>
+          <w:tcPr/>
+          <w:p>
+            <w:pPr>
+              <w:pStyle w:val="Compact"/>
+            </w:pPr>
+            <w:r>
+              <w:t xml:space="preserve">-0.001</w:t>
             </w:r>
           </w:p>
         </w:tc>
@@ -1865,73 +1865,73 @@
               <w:pStyle w:val="Compact"/>
             </w:pPr>
             <w:r>
-              <w:t xml:space="preserve">(0.047)</w:t>
-            </w:r>
-          </w:p>
-        </w:tc>
-        <w:tc>
-          <w:tcPr/>
-          <w:p>
-            <w:pPr>
-              <w:pStyle w:val="Compact"/>
-            </w:pPr>
-            <w:r>
-              <w:t xml:space="preserve">(0.052)</w:t>
-            </w:r>
-          </w:p>
-        </w:tc>
-        <w:tc>
-          <w:tcPr/>
-          <w:p>
-            <w:pPr>
-              <w:pStyle w:val="Compact"/>
-            </w:pPr>
-            <w:r>
-              <w:t xml:space="preserve">(0.067)</w:t>
-            </w:r>
-          </w:p>
-        </w:tc>
-        <w:tc>
-          <w:tcPr/>
-          <w:p>
-            <w:pPr>
-              <w:pStyle w:val="Compact"/>
-            </w:pPr>
-            <w:r>
-              <w:t xml:space="preserve">(0.071)</w:t>
-            </w:r>
-          </w:p>
-        </w:tc>
-        <w:tc>
-          <w:tcPr/>
-          <w:p>
-            <w:pPr>
-              <w:pStyle w:val="Compact"/>
-            </w:pPr>
-            <w:r>
-              <w:t xml:space="preserve">(0.068)</w:t>
-            </w:r>
-          </w:p>
-        </w:tc>
-        <w:tc>
-          <w:tcPr/>
-          <w:p>
-            <w:pPr>
-              <w:pStyle w:val="Compact"/>
-            </w:pPr>
-            <w:r>
-              <w:t xml:space="preserve">(0.102)</w:t>
-            </w:r>
-          </w:p>
-        </w:tc>
-        <w:tc>
-          <w:tcPr/>
-          <w:p>
-            <w:pPr>
-              <w:pStyle w:val="Compact"/>
-            </w:pPr>
-            <w:r>
-              <w:t xml:space="preserve">(0.064)</w:t>
+              <w:t xml:space="preserve">(0.128)</w:t>
+            </w:r>
+          </w:p>
+        </w:tc>
+        <w:tc>
+          <w:tcPr/>
+          <w:p>
+            <w:pPr>
+              <w:pStyle w:val="Compact"/>
+            </w:pPr>
+            <w:r>
+              <w:t xml:space="preserve">(0.128)</w:t>
+            </w:r>
+          </w:p>
+        </w:tc>
+        <w:tc>
+          <w:tcPr/>
+          <w:p>
+            <w:pPr>
+              <w:pStyle w:val="Compact"/>
+            </w:pPr>
+            <w:r>
+              <w:t xml:space="preserve">(0.453)</w:t>
+            </w:r>
+          </w:p>
+        </w:tc>
+        <w:tc>
+          <w:tcPr/>
+          <w:p>
+            <w:pPr>
+              <w:pStyle w:val="Compact"/>
+            </w:pPr>
+            <w:r>
+              <w:t xml:space="preserve">(0.069)</w:t>
+            </w:r>
+          </w:p>
+        </w:tc>
+        <w:tc>
+          <w:tcPr/>
+          <w:p>
+            <w:pPr>
+              <w:pStyle w:val="Compact"/>
+            </w:pPr>
+            <w:r>
+              <w:t xml:space="preserve">(0.133)</w:t>
+            </w:r>
+          </w:p>
+        </w:tc>
+        <w:tc>
+          <w:tcPr/>
+          <w:p>
+            <w:pPr>
+              <w:pStyle w:val="Compact"/>
+            </w:pPr>
+            <w:r>
+              <w:t xml:space="preserve">(0.149)</w:t>
+            </w:r>
+          </w:p>
+        </w:tc>
+        <w:tc>
+          <w:tcPr/>
+          <w:p>
+            <w:pPr>
+              <w:pStyle w:val="Compact"/>
+            </w:pPr>
+            <w:r>
+              <w:t xml:space="preserve">(0.096)</w:t>
             </w:r>
           </w:p>
         </w:tc>
@@ -1963,7 +1963,7 @@
               <w:pStyle w:val="Compact"/>
             </w:pPr>
             <w:r>
-              <w:t xml:space="preserve">0.000</w:t>
+              <w:t xml:space="preserve">0.002</w:t>
             </w:r>
           </w:p>
         </w:tc>
@@ -2032,7 +2032,7 @@
               <w:pStyle w:val="Compact"/>
             </w:pPr>
             <w:r>
-              <w:t xml:space="preserve">(0.002)</w:t>
+              <w:t xml:space="preserve">(0.003)</w:t>
             </w:r>
           </w:p>
         </w:tc>
@@ -2173,7 +2173,7 @@
               <w:pStyle w:val="Compact"/>
             </w:pPr>
             <w:r>
-              <w:t xml:space="preserve">(0.003)</w:t>
+              <w:t xml:space="preserve">(0.004)</w:t>
             </w:r>
           </w:p>
         </w:tc>
@@ -2245,7 +2245,7 @@
               <w:pStyle w:val="Compact"/>
             </w:pPr>
             <w:r>
-              <w:t xml:space="preserve">0.002</w:t>
+              <w:t xml:space="preserve">0.001</w:t>
             </w:r>
           </w:p>
         </w:tc>
@@ -2386,7 +2386,7 @@
               <w:pStyle w:val="Compact"/>
             </w:pPr>
             <w:r>
-              <w:t xml:space="preserve">-0.002</w:t>
+              <w:t xml:space="preserve">0.000</w:t>
             </w:r>
           </w:p>
         </w:tc>
@@ -2455,7 +2455,7 @@
               <w:pStyle w:val="Compact"/>
             </w:pPr>
             <w:r>
-              <w:t xml:space="preserve">(0.004)</w:t>
+              <w:t xml:space="preserve">(0.005)</w:t>
             </w:r>
           </w:p>
         </w:tc>
@@ -2519,73 +2519,73 @@
               <w:pStyle w:val="Compact"/>
             </w:pPr>
             <w:r>
-              <w:t xml:space="preserve">15054</w:t>
-            </w:r>
-          </w:p>
-        </w:tc>
-        <w:tc>
-          <w:tcPr/>
-          <w:p>
-            <w:pPr>
-              <w:pStyle w:val="Compact"/>
-            </w:pPr>
-            <w:r>
-              <w:t xml:space="preserve">15054</w:t>
-            </w:r>
-          </w:p>
-        </w:tc>
-        <w:tc>
-          <w:tcPr/>
-          <w:p>
-            <w:pPr>
-              <w:pStyle w:val="Compact"/>
-            </w:pPr>
-            <w:r>
-              <w:t xml:space="preserve">2541</w:t>
-            </w:r>
-          </w:p>
-        </w:tc>
-        <w:tc>
-          <w:tcPr/>
-          <w:p>
-            <w:pPr>
-              <w:pStyle w:val="Compact"/>
-            </w:pPr>
-            <w:r>
-              <w:t xml:space="preserve">2840</w:t>
-            </w:r>
-          </w:p>
-        </w:tc>
-        <w:tc>
-          <w:tcPr/>
-          <w:p>
-            <w:pPr>
-              <w:pStyle w:val="Compact"/>
-            </w:pPr>
-            <w:r>
-              <w:t xml:space="preserve">3104</w:t>
-            </w:r>
-          </w:p>
-        </w:tc>
-        <w:tc>
-          <w:tcPr/>
-          <w:p>
-            <w:pPr>
-              <w:pStyle w:val="Compact"/>
-            </w:pPr>
-            <w:r>
-              <w:t xml:space="preserve">3272</w:t>
-            </w:r>
-          </w:p>
-        </w:tc>
-        <w:tc>
-          <w:tcPr/>
-          <w:p>
-            <w:pPr>
-              <w:pStyle w:val="Compact"/>
-            </w:pPr>
-            <w:r>
-              <w:t xml:space="preserve">3297</w:t>
+              <w:t xml:space="preserve">3717</w:t>
+            </w:r>
+          </w:p>
+        </w:tc>
+        <w:tc>
+          <w:tcPr/>
+          <w:p>
+            <w:pPr>
+              <w:pStyle w:val="Compact"/>
+            </w:pPr>
+            <w:r>
+              <w:t xml:space="preserve">3717</w:t>
+            </w:r>
+          </w:p>
+        </w:tc>
+        <w:tc>
+          <w:tcPr/>
+          <w:p>
+            <w:pPr>
+              <w:pStyle w:val="Compact"/>
+            </w:pPr>
+            <w:r>
+              <w:t xml:space="preserve">596</w:t>
+            </w:r>
+          </w:p>
+        </w:tc>
+        <w:tc>
+          <w:tcPr/>
+          <w:p>
+            <w:pPr>
+              <w:pStyle w:val="Compact"/>
+            </w:pPr>
+            <w:r>
+              <w:t xml:space="preserve">837</w:t>
+            </w:r>
+          </w:p>
+        </w:tc>
+        <w:tc>
+          <w:tcPr/>
+          <w:p>
+            <w:pPr>
+              <w:pStyle w:val="Compact"/>
+            </w:pPr>
+            <w:r>
+              <w:t xml:space="preserve">888</w:t>
+            </w:r>
+          </w:p>
+        </w:tc>
+        <w:tc>
+          <w:tcPr/>
+          <w:p>
+            <w:pPr>
+              <w:pStyle w:val="Compact"/>
+            </w:pPr>
+            <w:r>
+              <w:t xml:space="preserve">918</w:t>
+            </w:r>
+          </w:p>
+        </w:tc>
+        <w:tc>
+          <w:tcPr/>
+          <w:p>
+            <w:pPr>
+              <w:pStyle w:val="Compact"/>
+            </w:pPr>
+            <w:r>
+              <w:t xml:space="preserve">478</w:t>
             </w:r>
           </w:p>
         </w:tc>
@@ -2609,73 +2609,73 @@
               <w:pStyle w:val="Compact"/>
             </w:pPr>
             <w:r>
-              <w:t xml:space="preserve">0.334</w:t>
-            </w:r>
-          </w:p>
-        </w:tc>
-        <w:tc>
-          <w:tcPr/>
-          <w:p>
-            <w:pPr>
-              <w:pStyle w:val="Compact"/>
-            </w:pPr>
-            <w:r>
-              <w:t xml:space="preserve">0.335</w:t>
-            </w:r>
-          </w:p>
-        </w:tc>
-        <w:tc>
-          <w:tcPr/>
-          <w:p>
-            <w:pPr>
-              <w:pStyle w:val="Compact"/>
-            </w:pPr>
-            <w:r>
-              <w:t xml:space="preserve">0.018</w:t>
-            </w:r>
-          </w:p>
-        </w:tc>
-        <w:tc>
-          <w:tcPr/>
-          <w:p>
-            <w:pPr>
-              <w:pStyle w:val="Compact"/>
-            </w:pPr>
-            <w:r>
-              <w:t xml:space="preserve">0.023</w:t>
-            </w:r>
-          </w:p>
-        </w:tc>
-        <w:tc>
-          <w:tcPr/>
-          <w:p>
-            <w:pPr>
-              <w:pStyle w:val="Compact"/>
-            </w:pPr>
-            <w:r>
-              <w:t xml:space="preserve">0.014</w:t>
-            </w:r>
-          </w:p>
-        </w:tc>
-        <w:tc>
-          <w:tcPr/>
-          <w:p>
-            <w:pPr>
-              <w:pStyle w:val="Compact"/>
-            </w:pPr>
-            <w:r>
-              <w:t xml:space="preserve">0.026</w:t>
-            </w:r>
-          </w:p>
-        </w:tc>
-        <w:tc>
-          <w:tcPr/>
-          <w:p>
-            <w:pPr>
-              <w:pStyle w:val="Compact"/>
-            </w:pPr>
-            <w:r>
-              <w:t xml:space="preserve">0.110</w:t>
+              <w:t xml:space="preserve">0.202</w:t>
+            </w:r>
+          </w:p>
+        </w:tc>
+        <w:tc>
+          <w:tcPr/>
+          <w:p>
+            <w:pPr>
+              <w:pStyle w:val="Compact"/>
+            </w:pPr>
+            <w:r>
+              <w:t xml:space="preserve">0.202</w:t>
+            </w:r>
+          </w:p>
+        </w:tc>
+        <w:tc>
+          <w:tcPr/>
+          <w:p>
+            <w:pPr>
+              <w:pStyle w:val="Compact"/>
+            </w:pPr>
+            <w:r>
+              <w:t xml:space="preserve">0.022</w:t>
+            </w:r>
+          </w:p>
+        </w:tc>
+        <w:tc>
+          <w:tcPr/>
+          <w:p>
+            <w:pPr>
+              <w:pStyle w:val="Compact"/>
+            </w:pPr>
+            <w:r>
+              <w:t xml:space="preserve">0.017</w:t>
+            </w:r>
+          </w:p>
+        </w:tc>
+        <w:tc>
+          <w:tcPr/>
+          <w:p>
+            <w:pPr>
+              <w:pStyle w:val="Compact"/>
+            </w:pPr>
+            <w:r>
+              <w:t xml:space="preserve">0.010</w:t>
+            </w:r>
+          </w:p>
+        </w:tc>
+        <w:tc>
+          <w:tcPr/>
+          <w:p>
+            <w:pPr>
+              <w:pStyle w:val="Compact"/>
+            </w:pPr>
+            <w:r>
+              <w:t xml:space="preserve">0.028</w:t>
+            </w:r>
+          </w:p>
+        </w:tc>
+        <w:tc>
+          <w:tcPr/>
+          <w:p>
+            <w:pPr>
+              <w:pStyle w:val="Compact"/>
+            </w:pPr>
+            <w:r>
+              <w:t xml:space="preserve">0.032</w:t>
             </w:r>
           </w:p>
         </w:tc>
@@ -2699,29 +2699,51 @@
               <w:pStyle w:val="Compact"/>
             </w:pPr>
             <w:r>
-              <w:t xml:space="preserve">0.334</w:t>
-            </w:r>
-          </w:p>
-        </w:tc>
-        <w:tc>
-          <w:tcPr/>
-          <w:p>
-            <w:pPr>
-              <w:pStyle w:val="Compact"/>
-            </w:pPr>
-            <w:r>
-              <w:t xml:space="preserve">0.334</w:t>
-            </w:r>
-          </w:p>
-        </w:tc>
-        <w:tc>
-          <w:tcPr/>
-          <w:p>
-            <w:pPr>
-              <w:pStyle w:val="Compact"/>
-            </w:pPr>
-            <w:r>
-              <w:t xml:space="preserve">0.015</w:t>
+              <w:t xml:space="preserve">0.200</w:t>
+            </w:r>
+          </w:p>
+        </w:tc>
+        <w:tc>
+          <w:tcPr/>
+          <w:p>
+            <w:pPr>
+              <w:pStyle w:val="Compact"/>
+            </w:pPr>
+            <w:r>
+              <w:t xml:space="preserve">0.199</w:t>
+            </w:r>
+          </w:p>
+        </w:tc>
+        <w:tc>
+          <w:tcPr/>
+          <w:p>
+            <w:pPr>
+              <w:pStyle w:val="Compact"/>
+            </w:pPr>
+            <w:r>
+              <w:t xml:space="preserve">0.012</w:t>
+            </w:r>
+          </w:p>
+        </w:tc>
+        <w:tc>
+          <w:tcPr/>
+          <w:p>
+            <w:pPr>
+              <w:pStyle w:val="Compact"/>
+            </w:pPr>
+            <w:r>
+              <w:t xml:space="preserve">0.010</w:t>
+            </w:r>
+          </w:p>
+        </w:tc>
+        <w:tc>
+          <w:tcPr/>
+          <w:p>
+            <w:pPr>
+              <w:pStyle w:val="Compact"/>
+            </w:pPr>
+            <w:r>
+              <w:t xml:space="preserve">0.003</w:t>
             </w:r>
           </w:p>
         </w:tc>
@@ -2743,29 +2765,7 @@
               <w:pStyle w:val="Compact"/>
             </w:pPr>
             <w:r>
-              <w:t xml:space="preserve">0.012</w:t>
-            </w:r>
-          </w:p>
-        </w:tc>
-        <w:tc>
-          <w:tcPr/>
-          <w:p>
-            <w:pPr>
-              <w:pStyle w:val="Compact"/>
-            </w:pPr>
-            <w:r>
-              <w:t xml:space="preserve">0.024</w:t>
-            </w:r>
-          </w:p>
-        </w:tc>
-        <w:tc>
-          <w:tcPr/>
-          <w:p>
-            <w:pPr>
-              <w:pStyle w:val="Compact"/>
-            </w:pPr>
-            <w:r>
-              <w:t xml:space="preserve">0.109</w:t>
+              <w:t xml:space="preserve">0.020</w:t>
             </w:r>
           </w:p>
         </w:tc>
@@ -2789,73 +2789,73 @@
               <w:pStyle w:val="Compact"/>
             </w:pPr>
             <w:r>
-              <w:t xml:space="preserve">24394.7</w:t>
-            </w:r>
-          </w:p>
-        </w:tc>
-        <w:tc>
-          <w:tcPr/>
-          <w:p>
-            <w:pPr>
-              <w:pStyle w:val="Compact"/>
-            </w:pPr>
-            <w:r>
-              <w:t xml:space="preserve">24394.6</w:t>
-            </w:r>
-          </w:p>
-        </w:tc>
-        <w:tc>
-          <w:tcPr/>
-          <w:p>
-            <w:pPr>
-              <w:pStyle w:val="Compact"/>
-            </w:pPr>
-            <w:r>
-              <w:t xml:space="preserve">3576.7</w:t>
-            </w:r>
-          </w:p>
-        </w:tc>
-        <w:tc>
-          <w:tcPr/>
-          <w:p>
-            <w:pPr>
-              <w:pStyle w:val="Compact"/>
-            </w:pPr>
-            <w:r>
-              <w:t xml:space="preserve">4021.8</w:t>
-            </w:r>
-          </w:p>
-        </w:tc>
-        <w:tc>
-          <w:tcPr/>
-          <w:p>
-            <w:pPr>
-              <w:pStyle w:val="Compact"/>
-            </w:pPr>
-            <w:r>
-              <w:t xml:space="preserve">4836.2</w:t>
-            </w:r>
-          </w:p>
-        </w:tc>
-        <w:tc>
-          <w:tcPr/>
-          <w:p>
-            <w:pPr>
-              <w:pStyle w:val="Compact"/>
-            </w:pPr>
-            <w:r>
-              <w:t xml:space="preserve">5358.1</w:t>
-            </w:r>
-          </w:p>
-        </w:tc>
-        <w:tc>
-          <w:tcPr/>
-          <w:p>
-            <w:pPr>
-              <w:pStyle w:val="Compact"/>
-            </w:pPr>
-            <w:r>
-              <w:t xml:space="preserve">6256.4</w:t>
+              <w:t xml:space="preserve">5710.2</w:t>
+            </w:r>
+          </w:p>
+        </w:tc>
+        <w:tc>
+          <w:tcPr/>
+          <w:p>
+            <w:pPr>
+              <w:pStyle w:val="Compact"/>
+            </w:pPr>
+            <w:r>
+              <w:t xml:space="preserve">5717.0</w:t>
+            </w:r>
+          </w:p>
+        </w:tc>
+        <w:tc>
+          <w:tcPr/>
+          <w:p>
+            <w:pPr>
+              <w:pStyle w:val="Compact"/>
+            </w:pPr>
+            <w:r>
+              <w:t xml:space="preserve">844.1</w:t>
+            </w:r>
+          </w:p>
+        </w:tc>
+        <w:tc>
+          <w:tcPr/>
+          <w:p>
+            <w:pPr>
+              <w:pStyle w:val="Compact"/>
+            </w:pPr>
+            <w:r>
+              <w:t xml:space="preserve">1164.2</w:t>
+            </w:r>
+          </w:p>
+        </w:tc>
+        <w:tc>
+          <w:tcPr/>
+          <w:p>
+            <w:pPr>
+              <w:pStyle w:val="Compact"/>
+            </w:pPr>
+            <w:r>
+              <w:t xml:space="preserve">1332.9</w:t>
+            </w:r>
+          </w:p>
+        </w:tc>
+        <w:tc>
+          <w:tcPr/>
+          <w:p>
+            <w:pPr>
+              <w:pStyle w:val="Compact"/>
+            </w:pPr>
+            <w:r>
+              <w:t xml:space="preserve">1485.6</w:t>
+            </w:r>
+          </w:p>
+        </w:tc>
+        <w:tc>
+          <w:tcPr/>
+          <w:p>
+            <w:pPr>
+              <w:pStyle w:val="Compact"/>
+            </w:pPr>
+            <w:r>
+              <w:t xml:space="preserve">876.6</w:t>
             </w:r>
           </w:p>
         </w:tc>
@@ -2879,73 +2879,73 @@
               <w:pStyle w:val="Compact"/>
             </w:pPr>
             <w:r>
-              <w:t xml:space="preserve">24486.2</w:t>
-            </w:r>
-          </w:p>
-        </w:tc>
-        <w:tc>
-          <w:tcPr/>
-          <w:p>
-            <w:pPr>
-              <w:pStyle w:val="Compact"/>
-            </w:pPr>
-            <w:r>
-              <w:t xml:space="preserve">24516.5</w:t>
-            </w:r>
-          </w:p>
-        </w:tc>
-        <w:tc>
-          <w:tcPr/>
-          <w:p>
-            <w:pPr>
-              <w:pStyle w:val="Compact"/>
-            </w:pPr>
-            <w:r>
-              <w:t xml:space="preserve">3623.5</w:t>
-            </w:r>
-          </w:p>
-        </w:tc>
-        <w:tc>
-          <w:tcPr/>
-          <w:p>
-            <w:pPr>
-              <w:pStyle w:val="Compact"/>
-            </w:pPr>
-            <w:r>
-              <w:t xml:space="preserve">4069.4</w:t>
-            </w:r>
-          </w:p>
-        </w:tc>
-        <w:tc>
-          <w:tcPr/>
-          <w:p>
-            <w:pPr>
-              <w:pStyle w:val="Compact"/>
-            </w:pPr>
-            <w:r>
-              <w:t xml:space="preserve">4884.5</w:t>
-            </w:r>
-          </w:p>
-        </w:tc>
-        <w:tc>
-          <w:tcPr/>
-          <w:p>
-            <w:pPr>
-              <w:pStyle w:val="Compact"/>
-            </w:pPr>
-            <w:r>
-              <w:t xml:space="preserve">5406.9</w:t>
-            </w:r>
-          </w:p>
-        </w:tc>
-        <w:tc>
-          <w:tcPr/>
-          <w:p>
-            <w:pPr>
-              <w:pStyle w:val="Compact"/>
-            </w:pPr>
-            <w:r>
-              <w:t xml:space="preserve">6305.2</w:t>
+              <w:t xml:space="preserve">5784.9</w:t>
+            </w:r>
+          </w:p>
+        </w:tc>
+        <w:tc>
+          <w:tcPr/>
+          <w:p>
+            <w:pPr>
+              <w:pStyle w:val="Compact"/>
+            </w:pPr>
+            <w:r>
+              <w:t xml:space="preserve">5816.5</w:t>
+            </w:r>
+          </w:p>
+        </w:tc>
+        <w:tc>
+          <w:tcPr/>
+          <w:p>
+            <w:pPr>
+              <w:pStyle w:val="Compact"/>
+            </w:pPr>
+            <w:r>
+              <w:t xml:space="preserve">879.2</w:t>
+            </w:r>
+          </w:p>
+        </w:tc>
+        <w:tc>
+          <w:tcPr/>
+          <w:p>
+            <w:pPr>
+              <w:pStyle w:val="Compact"/>
+            </w:pPr>
+            <w:r>
+              <w:t xml:space="preserve">1202.1</w:t>
+            </w:r>
+          </w:p>
+        </w:tc>
+        <w:tc>
+          <w:tcPr/>
+          <w:p>
+            <w:pPr>
+              <w:pStyle w:val="Compact"/>
+            </w:pPr>
+            <w:r>
+              <w:t xml:space="preserve">1371.2</w:t>
+            </w:r>
+          </w:p>
+        </w:tc>
+        <w:tc>
+          <w:tcPr/>
+          <w:p>
+            <w:pPr>
+              <w:pStyle w:val="Compact"/>
+            </w:pPr>
+            <w:r>
+              <w:t xml:space="preserve">1524.2</w:t>
+            </w:r>
+          </w:p>
+        </w:tc>
+        <w:tc>
+          <w:tcPr/>
+          <w:p>
+            <w:pPr>
+              <w:pStyle w:val="Compact"/>
+            </w:pPr>
+            <w:r>
+              <w:t xml:space="preserve">909.9</w:t>
             </w:r>
           </w:p>
         </w:tc>
@@ -2969,6 +2969,61 @@
               <w:pStyle w:val="Compact"/>
             </w:pPr>
             <w:r>
+              <w:t xml:space="preserve">0.52</w:t>
+            </w:r>
+          </w:p>
+        </w:tc>
+        <w:tc>
+          <w:tcPr/>
+          <w:p>
+            <w:pPr>
+              <w:pStyle w:val="Compact"/>
+            </w:pPr>
+            <w:r>
+              <w:t xml:space="preserve">0.52</w:t>
+            </w:r>
+          </w:p>
+        </w:tc>
+        <w:tc>
+          <w:tcPr/>
+          <w:p>
+            <w:pPr>
+              <w:pStyle w:val="Compact"/>
+            </w:pPr>
+            <w:r>
+              <w:t xml:space="preserve">0.48</w:t>
+            </w:r>
+          </w:p>
+        </w:tc>
+        <w:tc>
+          <w:tcPr/>
+          <w:p>
+            <w:pPr>
+              <w:pStyle w:val="Compact"/>
+            </w:pPr>
+            <w:r>
+              <w:t xml:space="preserve">0.48</w:t>
+            </w:r>
+          </w:p>
+        </w:tc>
+        <w:tc>
+          <w:tcPr/>
+          <w:p>
+            <w:pPr>
+              <w:pStyle w:val="Compact"/>
+            </w:pPr>
+            <w:r>
+              <w:t xml:space="preserve">0.51</w:t>
+            </w:r>
+          </w:p>
+        </w:tc>
+        <w:tc>
+          <w:tcPr/>
+          <w:p>
+            <w:pPr>
+              <w:pStyle w:val="Compact"/>
+            </w:pPr>
+            <w:r>
               <w:t xml:space="preserve">0.54</w:t>
             </w:r>
           </w:p>
@@ -2980,62 +3035,7 @@
               <w:pStyle w:val="Compact"/>
             </w:pPr>
             <w:r>
-              <w:t xml:space="preserve">0.54</w:t>
-            </w:r>
-          </w:p>
-        </w:tc>
-        <w:tc>
-          <w:tcPr/>
-          <w:p>
-            <w:pPr>
-              <w:pStyle w:val="Compact"/>
-            </w:pPr>
-            <w:r>
-              <w:t xml:space="preserve">0.49</w:t>
-            </w:r>
-          </w:p>
-        </w:tc>
-        <w:tc>
-          <w:tcPr/>
-          <w:p>
-            <w:pPr>
-              <w:pStyle w:val="Compact"/>
-            </w:pPr>
-            <w:r>
-              <w:t xml:space="preserve">0.49</w:t>
-            </w:r>
-          </w:p>
-        </w:tc>
-        <w:tc>
-          <w:tcPr/>
-          <w:p>
-            <w:pPr>
-              <w:pStyle w:val="Compact"/>
-            </w:pPr>
-            <w:r>
-              <w:t xml:space="preserve">0.53</w:t>
-            </w:r>
-          </w:p>
-        </w:tc>
-        <w:tc>
-          <w:tcPr/>
-          <w:p>
-            <w:pPr>
-              <w:pStyle w:val="Compact"/>
-            </w:pPr>
-            <w:r>
-              <w:t xml:space="preserve">0.55</w:t>
-            </w:r>
-          </w:p>
-        </w:tc>
-        <w:tc>
-          <w:tcPr/>
-          <w:p>
-            <w:pPr>
-              <w:pStyle w:val="Compact"/>
-            </w:pPr>
-            <w:r>
-              <w:t xml:space="preserve">0.62</w:t>
+              <w:t xml:space="preserve">0.60</w:t>
             </w:r>
           </w:p>
         </w:tc>

</xml_diff>

<commit_message>
this should be some of the last changes before submission
</commit_message>
<xml_diff>
--- a/output/tables/main_results_clustered.docx
+++ b/output/tables/main_results_clustered.docx
@@ -128,73 +128,73 @@
               <w:pStyle w:val="Compact"/>
             </w:pPr>
             <w:r>
-              <w:t xml:space="preserve">13.922</w:t>
-            </w:r>
-          </w:p>
-        </w:tc>
-        <w:tc>
-          <w:tcPr/>
-          <w:p>
-            <w:pPr>
-              <w:pStyle w:val="Compact"/>
-            </w:pPr>
-            <w:r>
-              <w:t xml:space="preserve">13.938</w:t>
-            </w:r>
-          </w:p>
-        </w:tc>
-        <w:tc>
-          <w:tcPr/>
-          <w:p>
-            <w:pPr>
-              <w:pStyle w:val="Compact"/>
-            </w:pPr>
-            <w:r>
-              <w:t xml:space="preserve">13.832</w:t>
-            </w:r>
-          </w:p>
-        </w:tc>
-        <w:tc>
-          <w:tcPr/>
-          <w:p>
-            <w:pPr>
-              <w:pStyle w:val="Compact"/>
-            </w:pPr>
-            <w:r>
-              <w:t xml:space="preserve">14.875</w:t>
-            </w:r>
-          </w:p>
-        </w:tc>
-        <w:tc>
-          <w:tcPr/>
-          <w:p>
-            <w:pPr>
-              <w:pStyle w:val="Compact"/>
-            </w:pPr>
-            <w:r>
-              <w:t xml:space="preserve">14.241</w:t>
-            </w:r>
-          </w:p>
-        </w:tc>
-        <w:tc>
-          <w:tcPr/>
-          <w:p>
-            <w:pPr>
-              <w:pStyle w:val="Compact"/>
-            </w:pPr>
-            <w:r>
-              <w:t xml:space="preserve">14.569</w:t>
-            </w:r>
-          </w:p>
-        </w:tc>
-        <w:tc>
-          <w:tcPr/>
-          <w:p>
-            <w:pPr>
-              <w:pStyle w:val="Compact"/>
-            </w:pPr>
-            <w:r>
-              <w:t xml:space="preserve">14.712</w:t>
+              <w:t xml:space="preserve">13.728</w:t>
+            </w:r>
+          </w:p>
+        </w:tc>
+        <w:tc>
+          <w:tcPr/>
+          <w:p>
+            <w:pPr>
+              <w:pStyle w:val="Compact"/>
+            </w:pPr>
+            <w:r>
+              <w:t xml:space="preserve">13.732</w:t>
+            </w:r>
+          </w:p>
+        </w:tc>
+        <w:tc>
+          <w:tcPr/>
+          <w:p>
+            <w:pPr>
+              <w:pStyle w:val="Compact"/>
+            </w:pPr>
+            <w:r>
+              <w:t xml:space="preserve">13.651</w:t>
+            </w:r>
+          </w:p>
+        </w:tc>
+        <w:tc>
+          <w:tcPr/>
+          <w:p>
+            <w:pPr>
+              <w:pStyle w:val="Compact"/>
+            </w:pPr>
+            <w:r>
+              <w:t xml:space="preserve">13.845</w:t>
+            </w:r>
+          </w:p>
+        </w:tc>
+        <w:tc>
+          <w:tcPr/>
+          <w:p>
+            <w:pPr>
+              <w:pStyle w:val="Compact"/>
+            </w:pPr>
+            <w:r>
+              <w:t xml:space="preserve">13.971</w:t>
+            </w:r>
+          </w:p>
+        </w:tc>
+        <w:tc>
+          <w:tcPr/>
+          <w:p>
+            <w:pPr>
+              <w:pStyle w:val="Compact"/>
+            </w:pPr>
+            <w:r>
+              <w:t xml:space="preserve">14.208</w:t>
+            </w:r>
+          </w:p>
+        </w:tc>
+        <w:tc>
+          <w:tcPr/>
+          <w:p>
+            <w:pPr>
+              <w:pStyle w:val="Compact"/>
+            </w:pPr>
+            <w:r>
+              <w:t xml:space="preserve">14.777</w:t>
             </w:r>
           </w:p>
         </w:tc>
@@ -215,73 +215,73 @@
               <w:pStyle w:val="Compact"/>
             </w:pPr>
             <w:r>
-              <w:t xml:space="preserve">(0.119)</w:t>
-            </w:r>
-          </w:p>
-        </w:tc>
-        <w:tc>
-          <w:tcPr/>
-          <w:p>
-            <w:pPr>
-              <w:pStyle w:val="Compact"/>
-            </w:pPr>
-            <w:r>
-              <w:t xml:space="preserve">(0.126)</w:t>
-            </w:r>
-          </w:p>
-        </w:tc>
-        <w:tc>
-          <w:tcPr/>
-          <w:p>
-            <w:pPr>
-              <w:pStyle w:val="Compact"/>
-            </w:pPr>
-            <w:r>
-              <w:t xml:space="preserve">(0.443)</w:t>
-            </w:r>
-          </w:p>
-        </w:tc>
-        <w:tc>
-          <w:tcPr/>
-          <w:p>
-            <w:pPr>
-              <w:pStyle w:val="Compact"/>
-            </w:pPr>
-            <w:r>
-              <w:t xml:space="preserve">(0.085)</w:t>
-            </w:r>
-          </w:p>
-        </w:tc>
-        <w:tc>
-          <w:tcPr/>
-          <w:p>
-            <w:pPr>
-              <w:pStyle w:val="Compact"/>
-            </w:pPr>
-            <w:r>
-              <w:t xml:space="preserve">(0.121)</w:t>
-            </w:r>
-          </w:p>
-        </w:tc>
-        <w:tc>
-          <w:tcPr/>
-          <w:p>
-            <w:pPr>
-              <w:pStyle w:val="Compact"/>
-            </w:pPr>
-            <w:r>
-              <w:t xml:space="preserve">(0.137)</w:t>
-            </w:r>
-          </w:p>
-        </w:tc>
-        <w:tc>
-          <w:tcPr/>
-          <w:p>
-            <w:pPr>
-              <w:pStyle w:val="Compact"/>
-            </w:pPr>
-            <w:r>
-              <w:t xml:space="preserve">(0.088)</w:t>
+              <w:t xml:space="preserve">(0.039)</w:t>
+            </w:r>
+          </w:p>
+        </w:tc>
+        <w:tc>
+          <w:tcPr/>
+          <w:p>
+            <w:pPr>
+              <w:pStyle w:val="Compact"/>
+            </w:pPr>
+            <w:r>
+              <w:t xml:space="preserve">(0.054)</w:t>
+            </w:r>
+          </w:p>
+        </w:tc>
+        <w:tc>
+          <w:tcPr/>
+          <w:p>
+            <w:pPr>
+              <w:pStyle w:val="Compact"/>
+            </w:pPr>
+            <w:r>
+              <w:t xml:space="preserve">(0.049)</w:t>
+            </w:r>
+          </w:p>
+        </w:tc>
+        <w:tc>
+          <w:tcPr/>
+          <w:p>
+            <w:pPr>
+              <w:pStyle w:val="Compact"/>
+            </w:pPr>
+            <w:r>
+              <w:t xml:space="preserve">(0.049)</w:t>
+            </w:r>
+          </w:p>
+        </w:tc>
+        <w:tc>
+          <w:tcPr/>
+          <w:p>
+            <w:pPr>
+              <w:pStyle w:val="Compact"/>
+            </w:pPr>
+            <w:r>
+              <w:t xml:space="preserve">(0.052)</w:t>
+            </w:r>
+          </w:p>
+        </w:tc>
+        <w:tc>
+          <w:tcPr/>
+          <w:p>
+            <w:pPr>
+              <w:pStyle w:val="Compact"/>
+            </w:pPr>
+            <w:r>
+              <w:t xml:space="preserve">(0.079)</w:t>
+            </w:r>
+          </w:p>
+        </w:tc>
+        <w:tc>
+          <w:tcPr/>
+          <w:p>
+            <w:pPr>
+              <w:pStyle w:val="Compact"/>
+            </w:pPr>
+            <w:r>
+              <w:t xml:space="preserve">(0.034)</w:t>
             </w:r>
           </w:p>
         </w:tc>
@@ -305,40 +305,62 @@
               <w:pStyle w:val="Compact"/>
             </w:pPr>
             <w:r>
-              <w:t xml:space="preserve">-0.006</w:t>
-            </w:r>
-          </w:p>
-        </w:tc>
-        <w:tc>
-          <w:tcPr/>
-          <w:p>
-            <w:pPr>
-              <w:pStyle w:val="Compact"/>
-            </w:pPr>
-            <w:r>
-              <w:t xml:space="preserve">-0.007</w:t>
-            </w:r>
-          </w:p>
-        </w:tc>
-        <w:tc>
-          <w:tcPr/>
-          <w:p>
-            <w:pPr>
-              <w:pStyle w:val="Compact"/>
-            </w:pPr>
-            <w:r>
-              <w:t xml:space="preserve">-0.010</w:t>
-            </w:r>
-          </w:p>
-        </w:tc>
-        <w:tc>
-          <w:tcPr/>
-          <w:p>
-            <w:pPr>
-              <w:pStyle w:val="Compact"/>
-            </w:pPr>
-            <w:r>
-              <w:t xml:space="preserve">-0.007</w:t>
+              <w:t xml:space="preserve">-0.003</w:t>
+            </w:r>
+          </w:p>
+        </w:tc>
+        <w:tc>
+          <w:tcPr/>
+          <w:p>
+            <w:pPr>
+              <w:pStyle w:val="Compact"/>
+            </w:pPr>
+            <w:r>
+              <w:t xml:space="preserve">-0.004</w:t>
+            </w:r>
+          </w:p>
+        </w:tc>
+        <w:tc>
+          <w:tcPr/>
+          <w:p>
+            <w:pPr>
+              <w:pStyle w:val="Compact"/>
+            </w:pPr>
+            <w:r>
+              <w:t xml:space="preserve">-0.005</w:t>
+            </w:r>
+          </w:p>
+        </w:tc>
+        <w:tc>
+          <w:tcPr/>
+          <w:p>
+            <w:pPr>
+              <w:pStyle w:val="Compact"/>
+            </w:pPr>
+            <w:r>
+              <w:t xml:space="preserve">-0.005</w:t>
+            </w:r>
+          </w:p>
+        </w:tc>
+        <w:tc>
+          <w:tcPr/>
+          <w:p>
+            <w:pPr>
+              <w:pStyle w:val="Compact"/>
+            </w:pPr>
+            <w:r>
+              <w:t xml:space="preserve">-0.001</w:t>
+            </w:r>
+          </w:p>
+        </w:tc>
+        <w:tc>
+          <w:tcPr/>
+          <w:p>
+            <w:pPr>
+              <w:pStyle w:val="Compact"/>
+            </w:pPr>
+            <w:r>
+              <w:t xml:space="preserve">-0.002</w:t>
             </w:r>
           </w:p>
         </w:tc>
@@ -350,28 +372,6 @@
             </w:pPr>
             <w:r>
               <w:t xml:space="preserve">0.001</w:t>
-            </w:r>
-          </w:p>
-        </w:tc>
-        <w:tc>
-          <w:tcPr/>
-          <w:p>
-            <w:pPr>
-              <w:pStyle w:val="Compact"/>
-            </w:pPr>
-            <w:r>
-              <w:t xml:space="preserve">-0.004</w:t>
-            </w:r>
-          </w:p>
-        </w:tc>
-        <w:tc>
-          <w:tcPr/>
-          <w:p>
-            <w:pPr>
-              <w:pStyle w:val="Compact"/>
-            </w:pPr>
-            <w:r>
-              <w:t xml:space="preserve">-0.011</w:t>
             </w:r>
           </w:p>
         </w:tc>
@@ -403,6 +403,28 @@
               <w:pStyle w:val="Compact"/>
             </w:pPr>
             <w:r>
+              <w:t xml:space="preserve">(0.003)</w:t>
+            </w:r>
+          </w:p>
+        </w:tc>
+        <w:tc>
+          <w:tcPr/>
+          <w:p>
+            <w:pPr>
+              <w:pStyle w:val="Compact"/>
+            </w:pPr>
+            <w:r>
+              <w:t xml:space="preserve">(0.003)</w:t>
+            </w:r>
+          </w:p>
+        </w:tc>
+        <w:tc>
+          <w:tcPr/>
+          <w:p>
+            <w:pPr>
+              <w:pStyle w:val="Compact"/>
+            </w:pPr>
+            <w:r>
               <w:t xml:space="preserve">(0.004)</w:t>
             </w:r>
           </w:p>
@@ -425,40 +447,18 @@
               <w:pStyle w:val="Compact"/>
             </w:pPr>
             <w:r>
-              <w:t xml:space="preserve">(0.006)</w:t>
-            </w:r>
-          </w:p>
-        </w:tc>
-        <w:tc>
-          <w:tcPr/>
-          <w:p>
-            <w:pPr>
-              <w:pStyle w:val="Compact"/>
-            </w:pPr>
-            <w:r>
-              <w:t xml:space="preserve">(0.003)</w:t>
-            </w:r>
-          </w:p>
-        </w:tc>
-        <w:tc>
-          <w:tcPr/>
-          <w:p>
-            <w:pPr>
-              <w:pStyle w:val="Compact"/>
-            </w:pPr>
-            <w:r>
-              <w:t xml:space="preserve">(0.006)</w:t>
-            </w:r>
-          </w:p>
-        </w:tc>
-        <w:tc>
-          <w:tcPr/>
-          <w:p>
-            <w:pPr>
-              <w:pStyle w:val="Compact"/>
-            </w:pPr>
-            <w:r>
-              <w:t xml:space="preserve">(0.007)</w:t>
+              <w:t xml:space="preserve">(0.004)</w:t>
+            </w:r>
+          </w:p>
+        </w:tc>
+        <w:tc>
+          <w:tcPr/>
+          <w:p>
+            <w:pPr>
+              <w:pStyle w:val="Compact"/>
+            </w:pPr>
+            <w:r>
+              <w:t xml:space="preserve">(0.004)</w:t>
             </w:r>
           </w:p>
         </w:tc>
@@ -482,18 +482,18 @@
               <w:pStyle w:val="Compact"/>
             </w:pPr>
             <w:r>
-              <w:t xml:space="preserve">0.236</w:t>
-            </w:r>
-          </w:p>
-        </w:tc>
-        <w:tc>
-          <w:tcPr/>
-          <w:p>
-            <w:pPr>
-              <w:pStyle w:val="Compact"/>
-            </w:pPr>
-            <w:r>
-              <w:t xml:space="preserve">0.215</w:t>
+              <w:t xml:space="preserve">0.257</w:t>
+            </w:r>
+          </w:p>
+        </w:tc>
+        <w:tc>
+          <w:tcPr/>
+          <w:p>
+            <w:pPr>
+              <w:pStyle w:val="Compact"/>
+            </w:pPr>
+            <w:r>
+              <w:t xml:space="preserve">0.256</w:t>
             </w:r>
           </w:p>
         </w:tc>
@@ -554,18 +554,18 @@
               <w:pStyle w:val="Compact"/>
             </w:pPr>
             <w:r>
-              <w:t xml:space="preserve">(0.024)</w:t>
-            </w:r>
-          </w:p>
-        </w:tc>
-        <w:tc>
-          <w:tcPr/>
-          <w:p>
-            <w:pPr>
-              <w:pStyle w:val="Compact"/>
-            </w:pPr>
-            <w:r>
-              <w:t xml:space="preserve">(0.043)</w:t>
+              <w:t xml:space="preserve">(0.016)</w:t>
+            </w:r>
+          </w:p>
+        </w:tc>
+        <w:tc>
+          <w:tcPr/>
+          <w:p>
+            <w:pPr>
+              <w:pStyle w:val="Compact"/>
+            </w:pPr>
+            <w:r>
+              <w:t xml:space="preserve">(0.030)</w:t>
             </w:r>
           </w:p>
         </w:tc>
@@ -629,18 +629,18 @@
               <w:pStyle w:val="Compact"/>
             </w:pPr>
             <w:r>
-              <w:t xml:space="preserve">0.392</w:t>
-            </w:r>
-          </w:p>
-        </w:tc>
-        <w:tc>
-          <w:tcPr/>
-          <w:p>
-            <w:pPr>
-              <w:pStyle w:val="Compact"/>
-            </w:pPr>
-            <w:r>
-              <w:t xml:space="preserve">0.356</w:t>
+              <w:t xml:space="preserve">0.397</w:t>
+            </w:r>
+          </w:p>
+        </w:tc>
+        <w:tc>
+          <w:tcPr/>
+          <w:p>
+            <w:pPr>
+              <w:pStyle w:val="Compact"/>
+            </w:pPr>
+            <w:r>
+              <w:t xml:space="preserve">0.364</w:t>
             </w:r>
           </w:p>
         </w:tc>
@@ -701,18 +701,18 @@
               <w:pStyle w:val="Compact"/>
             </w:pPr>
             <w:r>
-              <w:t xml:space="preserve">(0.028)</w:t>
-            </w:r>
-          </w:p>
-        </w:tc>
-        <w:tc>
-          <w:tcPr/>
-          <w:p>
-            <w:pPr>
-              <w:pStyle w:val="Compact"/>
-            </w:pPr>
-            <w:r>
-              <w:t xml:space="preserve">(0.053)</w:t>
+              <w:t xml:space="preserve">(0.023)</w:t>
+            </w:r>
+          </w:p>
+        </w:tc>
+        <w:tc>
+          <w:tcPr/>
+          <w:p>
+            <w:pPr>
+              <w:pStyle w:val="Compact"/>
+            </w:pPr>
+            <w:r>
+              <w:t xml:space="preserve">(0.046)</w:t>
             </w:r>
           </w:p>
         </w:tc>
@@ -776,18 +776,18 @@
               <w:pStyle w:val="Compact"/>
             </w:pPr>
             <w:r>
-              <w:t xml:space="preserve">0.531</w:t>
-            </w:r>
-          </w:p>
-        </w:tc>
-        <w:tc>
-          <w:tcPr/>
-          <w:p>
-            <w:pPr>
-              <w:pStyle w:val="Compact"/>
-            </w:pPr>
-            <w:r>
-              <w:t xml:space="preserve">0.519</w:t>
+              <w:t xml:space="preserve">0.581</w:t>
+            </w:r>
+          </w:p>
+        </w:tc>
+        <w:tc>
+          <w:tcPr/>
+          <w:p>
+            <w:pPr>
+              <w:pStyle w:val="Compact"/>
+            </w:pPr>
+            <w:r>
+              <w:t xml:space="preserve">0.558</w:t>
             </w:r>
           </w:p>
         </w:tc>
@@ -848,18 +848,18 @@
               <w:pStyle w:val="Compact"/>
             </w:pPr>
             <w:r>
-              <w:t xml:space="preserve">(0.025)</w:t>
-            </w:r>
-          </w:p>
-        </w:tc>
-        <w:tc>
-          <w:tcPr/>
-          <w:p>
-            <w:pPr>
-              <w:pStyle w:val="Compact"/>
-            </w:pPr>
-            <w:r>
-              <w:t xml:space="preserve">(0.048)</w:t>
+              <w:t xml:space="preserve">(0.024)</w:t>
+            </w:r>
+          </w:p>
+        </w:tc>
+        <w:tc>
+          <w:tcPr/>
+          <w:p>
+            <w:pPr>
+              <w:pStyle w:val="Compact"/>
+            </w:pPr>
+            <w:r>
+              <w:t xml:space="preserve">(0.051)</w:t>
             </w:r>
           </w:p>
         </w:tc>
@@ -923,18 +923,18 @@
               <w:pStyle w:val="Compact"/>
             </w:pPr>
             <w:r>
-              <w:t xml:space="preserve">0.850</w:t>
-            </w:r>
-          </w:p>
-        </w:tc>
-        <w:tc>
-          <w:tcPr/>
-          <w:p>
-            <w:pPr>
-              <w:pStyle w:val="Compact"/>
-            </w:pPr>
-            <w:r>
-              <w:t xml:space="preserve">0.849</w:t>
+              <w:t xml:space="preserve">0.983</w:t>
+            </w:r>
+          </w:p>
+        </w:tc>
+        <w:tc>
+          <w:tcPr/>
+          <w:p>
+            <w:pPr>
+              <w:pStyle w:val="Compact"/>
+            </w:pPr>
+            <w:r>
+              <w:t xml:space="preserve">0.998</w:t>
             </w:r>
           </w:p>
         </w:tc>
@@ -995,18 +995,18 @@
               <w:pStyle w:val="Compact"/>
             </w:pPr>
             <w:r>
-              <w:t xml:space="preserve">(0.039)</w:t>
-            </w:r>
-          </w:p>
-        </w:tc>
-        <w:tc>
-          <w:tcPr/>
-          <w:p>
-            <w:pPr>
-              <w:pStyle w:val="Compact"/>
-            </w:pPr>
-            <w:r>
-              <w:t xml:space="preserve">(0.081)</w:t>
+              <w:t xml:space="preserve">(0.036)</w:t>
+            </w:r>
+          </w:p>
+        </w:tc>
+        <w:tc>
+          <w:tcPr/>
+          <w:p>
+            <w:pPr>
+              <w:pStyle w:val="Compact"/>
+            </w:pPr>
+            <w:r>
+              <w:t xml:space="preserve">(0.063)</w:t>
             </w:r>
           </w:p>
         </w:tc>
@@ -1070,73 +1070,73 @@
               <w:pStyle w:val="Compact"/>
             </w:pPr>
             <w:r>
-              <w:t xml:space="preserve">-0.158</w:t>
-            </w:r>
-          </w:p>
-        </w:tc>
-        <w:tc>
-          <w:tcPr/>
-          <w:p>
-            <w:pPr>
-              <w:pStyle w:val="Compact"/>
-            </w:pPr>
-            <w:r>
-              <w:t xml:space="preserve">-0.157</w:t>
-            </w:r>
-          </w:p>
-        </w:tc>
-        <w:tc>
-          <w:tcPr/>
-          <w:p>
-            <w:pPr>
-              <w:pStyle w:val="Compact"/>
-            </w:pPr>
-            <w:r>
-              <w:t xml:space="preserve">-0.127</w:t>
-            </w:r>
-          </w:p>
-        </w:tc>
-        <w:tc>
-          <w:tcPr/>
-          <w:p>
-            <w:pPr>
-              <w:pStyle w:val="Compact"/>
-            </w:pPr>
-            <w:r>
-              <w:t xml:space="preserve">-0.099</w:t>
-            </w:r>
-          </w:p>
-        </w:tc>
-        <w:tc>
-          <w:tcPr/>
-          <w:p>
-            <w:pPr>
-              <w:pStyle w:val="Compact"/>
-            </w:pPr>
-            <w:r>
-              <w:t xml:space="preserve">-0.064</w:t>
-            </w:r>
-          </w:p>
-        </w:tc>
-        <w:tc>
-          <w:tcPr/>
-          <w:p>
-            <w:pPr>
-              <w:pStyle w:val="Compact"/>
-            </w:pPr>
-            <w:r>
-              <w:t xml:space="preserve">-0.239</w:t>
-            </w:r>
-          </w:p>
-        </w:tc>
-        <w:tc>
-          <w:tcPr/>
-          <w:p>
-            <w:pPr>
-              <w:pStyle w:val="Compact"/>
-            </w:pPr>
-            <w:r>
-              <w:t xml:space="preserve">-0.179</w:t>
+              <w:t xml:space="preserve">-0.125</w:t>
+            </w:r>
+          </w:p>
+        </w:tc>
+        <w:tc>
+          <w:tcPr/>
+          <w:p>
+            <w:pPr>
+              <w:pStyle w:val="Compact"/>
+            </w:pPr>
+            <w:r>
+              <w:t xml:space="preserve">-0.124</w:t>
+            </w:r>
+          </w:p>
+        </w:tc>
+        <w:tc>
+          <w:tcPr/>
+          <w:p>
+            <w:pPr>
+              <w:pStyle w:val="Compact"/>
+            </w:pPr>
+            <w:r>
+              <w:t xml:space="preserve">-0.049</w:t>
+            </w:r>
+          </w:p>
+        </w:tc>
+        <w:tc>
+          <w:tcPr/>
+          <w:p>
+            <w:pPr>
+              <w:pStyle w:val="Compact"/>
+            </w:pPr>
+            <w:r>
+              <w:t xml:space="preserve">-0.050</w:t>
+            </w:r>
+          </w:p>
+        </w:tc>
+        <w:tc>
+          <w:tcPr/>
+          <w:p>
+            <w:pPr>
+              <w:pStyle w:val="Compact"/>
+            </w:pPr>
+            <w:r>
+              <w:t xml:space="preserve">-0.043</w:t>
+            </w:r>
+          </w:p>
+        </w:tc>
+        <w:tc>
+          <w:tcPr/>
+          <w:p>
+            <w:pPr>
+              <w:pStyle w:val="Compact"/>
+            </w:pPr>
+            <w:r>
+              <w:t xml:space="preserve">-0.118</w:t>
+            </w:r>
+          </w:p>
+        </w:tc>
+        <w:tc>
+          <w:tcPr/>
+          <w:p>
+            <w:pPr>
+              <w:pStyle w:val="Compact"/>
+            </w:pPr>
+            <w:r>
+              <w:t xml:space="preserve">-0.274</w:t>
             </w:r>
           </w:p>
         </w:tc>
@@ -1157,73 +1157,73 @@
               <w:pStyle w:val="Compact"/>
             </w:pPr>
             <w:r>
-              <w:t xml:space="preserve">(0.024)</w:t>
-            </w:r>
-          </w:p>
-        </w:tc>
-        <w:tc>
-          <w:tcPr/>
-          <w:p>
-            <w:pPr>
-              <w:pStyle w:val="Compact"/>
-            </w:pPr>
-            <w:r>
-              <w:t xml:space="preserve">(0.024)</w:t>
-            </w:r>
-          </w:p>
-        </w:tc>
-        <w:tc>
-          <w:tcPr/>
-          <w:p>
-            <w:pPr>
-              <w:pStyle w:val="Compact"/>
-            </w:pPr>
-            <w:r>
-              <w:t xml:space="preserve">(0.087)</w:t>
-            </w:r>
-          </w:p>
-        </w:tc>
-        <w:tc>
-          <w:tcPr/>
-          <w:p>
-            <w:pPr>
-              <w:pStyle w:val="Compact"/>
-            </w:pPr>
-            <w:r>
-              <w:t xml:space="preserve">(0.053)</w:t>
-            </w:r>
-          </w:p>
-        </w:tc>
-        <w:tc>
-          <w:tcPr/>
-          <w:p>
-            <w:pPr>
-              <w:pStyle w:val="Compact"/>
-            </w:pPr>
-            <w:r>
-              <w:t xml:space="preserve">(0.060)</w:t>
-            </w:r>
-          </w:p>
-        </w:tc>
-        <w:tc>
-          <w:tcPr/>
-          <w:p>
-            <w:pPr>
-              <w:pStyle w:val="Compact"/>
-            </w:pPr>
-            <w:r>
-              <w:t xml:space="preserve">(0.058)</w:t>
-            </w:r>
-          </w:p>
-        </w:tc>
-        <w:tc>
-          <w:tcPr/>
-          <w:p>
-            <w:pPr>
-              <w:pStyle w:val="Compact"/>
-            </w:pPr>
-            <w:r>
-              <w:t xml:space="preserve">(0.068)</w:t>
+              <w:t xml:space="preserve">(0.019)</w:t>
+            </w:r>
+          </w:p>
+        </w:tc>
+        <w:tc>
+          <w:tcPr/>
+          <w:p>
+            <w:pPr>
+              <w:pStyle w:val="Compact"/>
+            </w:pPr>
+            <w:r>
+              <w:t xml:space="preserve">(0.019)</w:t>
+            </w:r>
+          </w:p>
+        </w:tc>
+        <w:tc>
+          <w:tcPr/>
+          <w:p>
+            <w:pPr>
+              <w:pStyle w:val="Compact"/>
+            </w:pPr>
+            <w:r>
+              <w:t xml:space="preserve">(0.033)</w:t>
+            </w:r>
+          </w:p>
+        </w:tc>
+        <w:tc>
+          <w:tcPr/>
+          <w:p>
+            <w:pPr>
+              <w:pStyle w:val="Compact"/>
+            </w:pPr>
+            <w:r>
+              <w:t xml:space="preserve">(0.032)</w:t>
+            </w:r>
+          </w:p>
+        </w:tc>
+        <w:tc>
+          <w:tcPr/>
+          <w:p>
+            <w:pPr>
+              <w:pStyle w:val="Compact"/>
+            </w:pPr>
+            <w:r>
+              <w:t xml:space="preserve">(0.033)</w:t>
+            </w:r>
+          </w:p>
+        </w:tc>
+        <w:tc>
+          <w:tcPr/>
+          <w:p>
+            <w:pPr>
+              <w:pStyle w:val="Compact"/>
+            </w:pPr>
+            <w:r>
+              <w:t xml:space="preserve">(0.028)</w:t>
+            </w:r>
+          </w:p>
+        </w:tc>
+        <w:tc>
+          <w:tcPr/>
+          <w:p>
+            <w:pPr>
+              <w:pStyle w:val="Compact"/>
+            </w:pPr>
+            <w:r>
+              <w:t xml:space="preserve">(0.049)</w:t>
             </w:r>
           </w:p>
         </w:tc>
@@ -1247,73 +1247,73 @@
               <w:pStyle w:val="Compact"/>
             </w:pPr>
             <w:r>
-              <w:t xml:space="preserve">-0.245</w:t>
-            </w:r>
-          </w:p>
-        </w:tc>
-        <w:tc>
-          <w:tcPr/>
-          <w:p>
-            <w:pPr>
-              <w:pStyle w:val="Compact"/>
-            </w:pPr>
-            <w:r>
-              <w:t xml:space="preserve">-0.245</w:t>
-            </w:r>
-          </w:p>
-        </w:tc>
-        <w:tc>
-          <w:tcPr/>
-          <w:p>
-            <w:pPr>
-              <w:pStyle w:val="Compact"/>
-            </w:pPr>
-            <w:r>
-              <w:t xml:space="preserve">-0.111</w:t>
-            </w:r>
-          </w:p>
-        </w:tc>
-        <w:tc>
-          <w:tcPr/>
-          <w:p>
-            <w:pPr>
-              <w:pStyle w:val="Compact"/>
-            </w:pPr>
-            <w:r>
-              <w:t xml:space="preserve">-1.015</w:t>
-            </w:r>
-          </w:p>
-        </w:tc>
-        <w:tc>
-          <w:tcPr/>
-          <w:p>
-            <w:pPr>
-              <w:pStyle w:val="Compact"/>
-            </w:pPr>
-            <w:r>
-              <w:t xml:space="preserve">-0.315</w:t>
-            </w:r>
-          </w:p>
-        </w:tc>
-        <w:tc>
-          <w:tcPr/>
-          <w:p>
-            <w:pPr>
-              <w:pStyle w:val="Compact"/>
-            </w:pPr>
-            <w:r>
-              <w:t xml:space="preserve">-0.281</w:t>
-            </w:r>
-          </w:p>
-        </w:tc>
-        <w:tc>
-          <w:tcPr/>
-          <w:p>
-            <w:pPr>
-              <w:pStyle w:val="Compact"/>
-            </w:pPr>
-            <w:r>
-              <w:t xml:space="preserve">-0.217</w:t>
+              <w:t xml:space="preserve">-0.225</w:t>
+            </w:r>
+          </w:p>
+        </w:tc>
+        <w:tc>
+          <w:tcPr/>
+          <w:p>
+            <w:pPr>
+              <w:pStyle w:val="Compact"/>
+            </w:pPr>
+            <w:r>
+              <w:t xml:space="preserve">-0.221</w:t>
+            </w:r>
+          </w:p>
+        </w:tc>
+        <w:tc>
+          <w:tcPr/>
+          <w:p>
+            <w:pPr>
+              <w:pStyle w:val="Compact"/>
+            </w:pPr>
+            <w:r>
+              <w:t xml:space="preserve">-0.176</w:t>
+            </w:r>
+          </w:p>
+        </w:tc>
+        <w:tc>
+          <w:tcPr/>
+          <w:p>
+            <w:pPr>
+              <w:pStyle w:val="Compact"/>
+            </w:pPr>
+            <w:r>
+              <w:t xml:space="preserve">-0.144</w:t>
+            </w:r>
+          </w:p>
+        </w:tc>
+        <w:tc>
+          <w:tcPr/>
+          <w:p>
+            <w:pPr>
+              <w:pStyle w:val="Compact"/>
+            </w:pPr>
+            <w:r>
+              <w:t xml:space="preserve">-0.161</w:t>
+            </w:r>
+          </w:p>
+        </w:tc>
+        <w:tc>
+          <w:tcPr/>
+          <w:p>
+            <w:pPr>
+              <w:pStyle w:val="Compact"/>
+            </w:pPr>
+            <w:r>
+              <w:t xml:space="preserve">-0.134</w:t>
+            </w:r>
+          </w:p>
+        </w:tc>
+        <w:tc>
+          <w:tcPr/>
+          <w:p>
+            <w:pPr>
+              <w:pStyle w:val="Compact"/>
+            </w:pPr>
+            <w:r>
+              <w:t xml:space="preserve">-0.254</w:t>
             </w:r>
           </w:p>
         </w:tc>
@@ -1334,73 +1334,73 @@
               <w:pStyle w:val="Compact"/>
             </w:pPr>
             <w:r>
-              <w:t xml:space="preserve">(0.118)</w:t>
-            </w:r>
-          </w:p>
-        </w:tc>
-        <w:tc>
-          <w:tcPr/>
-          <w:p>
-            <w:pPr>
-              <w:pStyle w:val="Compact"/>
-            </w:pPr>
-            <w:r>
-              <w:t xml:space="preserve">(0.118)</w:t>
-            </w:r>
-          </w:p>
-        </w:tc>
-        <w:tc>
-          <w:tcPr/>
-          <w:p>
-            <w:pPr>
-              <w:pStyle w:val="Compact"/>
-            </w:pPr>
-            <w:r>
-              <w:t xml:space="preserve">(0.452)</w:t>
-            </w:r>
-          </w:p>
-        </w:tc>
-        <w:tc>
-          <w:tcPr/>
-          <w:p>
-            <w:pPr>
-              <w:pStyle w:val="Compact"/>
-            </w:pPr>
-            <w:r>
-              <w:t xml:space="preserve">(0.048)</w:t>
-            </w:r>
-          </w:p>
-        </w:tc>
-        <w:tc>
-          <w:tcPr/>
-          <w:p>
-            <w:pPr>
-              <w:pStyle w:val="Compact"/>
-            </w:pPr>
-            <w:r>
-              <w:t xml:space="preserve">(0.132)</w:t>
-            </w:r>
-          </w:p>
-        </w:tc>
-        <w:tc>
-          <w:tcPr/>
-          <w:p>
-            <w:pPr>
-              <w:pStyle w:val="Compact"/>
-            </w:pPr>
-            <w:r>
-              <w:t xml:space="preserve">(0.125)</w:t>
-            </w:r>
-          </w:p>
-        </w:tc>
-        <w:tc>
-          <w:tcPr/>
-          <w:p>
-            <w:pPr>
-              <w:pStyle w:val="Compact"/>
-            </w:pPr>
-            <w:r>
-              <w:t xml:space="preserve">(0.076)</w:t>
+              <w:t xml:space="preserve">(0.036)</w:t>
+            </w:r>
+          </w:p>
+        </w:tc>
+        <w:tc>
+          <w:tcPr/>
+          <w:p>
+            <w:pPr>
+              <w:pStyle w:val="Compact"/>
+            </w:pPr>
+            <w:r>
+              <w:t xml:space="preserve">(0.040)</w:t>
+            </w:r>
+          </w:p>
+        </w:tc>
+        <w:tc>
+          <w:tcPr/>
+          <w:p>
+            <w:pPr>
+              <w:pStyle w:val="Compact"/>
+            </w:pPr>
+            <w:r>
+              <w:t xml:space="preserve">(0.070)</w:t>
+            </w:r>
+          </w:p>
+        </w:tc>
+        <w:tc>
+          <w:tcPr/>
+          <w:p>
+            <w:pPr>
+              <w:pStyle w:val="Compact"/>
+            </w:pPr>
+            <w:r>
+              <w:t xml:space="preserve">(0.071)</w:t>
+            </w:r>
+          </w:p>
+        </w:tc>
+        <w:tc>
+          <w:tcPr/>
+          <w:p>
+            <w:pPr>
+              <w:pStyle w:val="Compact"/>
+            </w:pPr>
+            <w:r>
+              <w:t xml:space="preserve">(0.059)</w:t>
+            </w:r>
+          </w:p>
+        </w:tc>
+        <w:tc>
+          <w:tcPr/>
+          <w:p>
+            <w:pPr>
+              <w:pStyle w:val="Compact"/>
+            </w:pPr>
+            <w:r>
+              <w:t xml:space="preserve">(0.081)</w:t>
+            </w:r>
+          </w:p>
+        </w:tc>
+        <w:tc>
+          <w:tcPr/>
+          <w:p>
+            <w:pPr>
+              <w:pStyle w:val="Compact"/>
+            </w:pPr>
+            <w:r>
+              <w:t xml:space="preserve">(0.059)</w:t>
             </w:r>
           </w:p>
         </w:tc>
@@ -1424,73 +1424,73 @@
               <w:pStyle w:val="Compact"/>
             </w:pPr>
             <w:r>
-              <w:t xml:space="preserve">-0.213</w:t>
-            </w:r>
-          </w:p>
-        </w:tc>
-        <w:tc>
-          <w:tcPr/>
-          <w:p>
-            <w:pPr>
-              <w:pStyle w:val="Compact"/>
-            </w:pPr>
-            <w:r>
-              <w:t xml:space="preserve">-0.213</w:t>
-            </w:r>
-          </w:p>
-        </w:tc>
-        <w:tc>
-          <w:tcPr/>
-          <w:p>
-            <w:pPr>
-              <w:pStyle w:val="Compact"/>
-            </w:pPr>
-            <w:r>
-              <w:t xml:space="preserve">-0.126</w:t>
-            </w:r>
-          </w:p>
-        </w:tc>
-        <w:tc>
-          <w:tcPr/>
-          <w:p>
-            <w:pPr>
-              <w:pStyle w:val="Compact"/>
-            </w:pPr>
-            <w:r>
-              <w:t xml:space="preserve">-0.963</w:t>
-            </w:r>
-          </w:p>
-        </w:tc>
-        <w:tc>
-          <w:tcPr/>
-          <w:p>
-            <w:pPr>
-              <w:pStyle w:val="Compact"/>
-            </w:pPr>
-            <w:r>
-              <w:t xml:space="preserve">-0.282</w:t>
-            </w:r>
-          </w:p>
-        </w:tc>
-        <w:tc>
-          <w:tcPr/>
-          <w:p>
-            <w:pPr>
-              <w:pStyle w:val="Compact"/>
-            </w:pPr>
-            <w:r>
-              <w:t xml:space="preserve">-0.264</w:t>
-            </w:r>
-          </w:p>
-        </w:tc>
-        <w:tc>
-          <w:tcPr/>
-          <w:p>
-            <w:pPr>
-              <w:pStyle w:val="Compact"/>
-            </w:pPr>
-            <w:r>
-              <w:t xml:space="preserve">-0.088</w:t>
+              <w:t xml:space="preserve">-0.145</w:t>
+            </w:r>
+          </w:p>
+        </w:tc>
+        <w:tc>
+          <w:tcPr/>
+          <w:p>
+            <w:pPr>
+              <w:pStyle w:val="Compact"/>
+            </w:pPr>
+            <w:r>
+              <w:t xml:space="preserve">-0.140</w:t>
+            </w:r>
+          </w:p>
+        </w:tc>
+        <w:tc>
+          <w:tcPr/>
+          <w:p>
+            <w:pPr>
+              <w:pStyle w:val="Compact"/>
+            </w:pPr>
+            <w:r>
+              <w:t xml:space="preserve">-0.113</w:t>
+            </w:r>
+          </w:p>
+        </w:tc>
+        <w:tc>
+          <w:tcPr/>
+          <w:p>
+            <w:pPr>
+              <w:pStyle w:val="Compact"/>
+            </w:pPr>
+            <w:r>
+              <w:t xml:space="preserve">-0.023</w:t>
+            </w:r>
+          </w:p>
+        </w:tc>
+        <w:tc>
+          <w:tcPr/>
+          <w:p>
+            <w:pPr>
+              <w:pStyle w:val="Compact"/>
+            </w:pPr>
+            <w:r>
+              <w:t xml:space="preserve">-0.063</w:t>
+            </w:r>
+          </w:p>
+        </w:tc>
+        <w:tc>
+          <w:tcPr/>
+          <w:p>
+            <w:pPr>
+              <w:pStyle w:val="Compact"/>
+            </w:pPr>
+            <w:r>
+              <w:t xml:space="preserve">-0.051</w:t>
+            </w:r>
+          </w:p>
+        </w:tc>
+        <w:tc>
+          <w:tcPr/>
+          <w:p>
+            <w:pPr>
+              <w:pStyle w:val="Compact"/>
+            </w:pPr>
+            <w:r>
+              <w:t xml:space="preserve">-0.242</w:t>
             </w:r>
           </w:p>
         </w:tc>
@@ -1511,73 +1511,73 @@
               <w:pStyle w:val="Compact"/>
             </w:pPr>
             <w:r>
-              <w:t xml:space="preserve">(0.120)</w:t>
-            </w:r>
-          </w:p>
-        </w:tc>
-        <w:tc>
-          <w:tcPr/>
-          <w:p>
-            <w:pPr>
-              <w:pStyle w:val="Compact"/>
-            </w:pPr>
-            <w:r>
-              <w:t xml:space="preserve">(0.121)</w:t>
-            </w:r>
-          </w:p>
-        </w:tc>
-        <w:tc>
-          <w:tcPr/>
-          <w:p>
-            <w:pPr>
-              <w:pStyle w:val="Compact"/>
-            </w:pPr>
-            <w:r>
-              <w:t xml:space="preserve">(0.453)</w:t>
-            </w:r>
-          </w:p>
-        </w:tc>
-        <w:tc>
-          <w:tcPr/>
-          <w:p>
-            <w:pPr>
-              <w:pStyle w:val="Compact"/>
-            </w:pPr>
-            <w:r>
-              <w:t xml:space="preserve">(0.054)</w:t>
-            </w:r>
-          </w:p>
-        </w:tc>
-        <w:tc>
-          <w:tcPr/>
-          <w:p>
-            <w:pPr>
-              <w:pStyle w:val="Compact"/>
-            </w:pPr>
-            <w:r>
-              <w:t xml:space="preserve">(0.129)</w:t>
-            </w:r>
-          </w:p>
-        </w:tc>
-        <w:tc>
-          <w:tcPr/>
-          <w:p>
-            <w:pPr>
-              <w:pStyle w:val="Compact"/>
-            </w:pPr>
-            <w:r>
-              <w:t xml:space="preserve">(0.129)</w:t>
-            </w:r>
-          </w:p>
-        </w:tc>
-        <w:tc>
-          <w:tcPr/>
-          <w:p>
-            <w:pPr>
-              <w:pStyle w:val="Compact"/>
-            </w:pPr>
-            <w:r>
-              <w:t xml:space="preserve">(0.091)</w:t>
+              <w:t xml:space="preserve">(0.038)</w:t>
+            </w:r>
+          </w:p>
+        </w:tc>
+        <w:tc>
+          <w:tcPr/>
+          <w:p>
+            <w:pPr>
+              <w:pStyle w:val="Compact"/>
+            </w:pPr>
+            <w:r>
+              <w:t xml:space="preserve">(0.044)</w:t>
+            </w:r>
+          </w:p>
+        </w:tc>
+        <w:tc>
+          <w:tcPr/>
+          <w:p>
+            <w:pPr>
+              <w:pStyle w:val="Compact"/>
+            </w:pPr>
+            <w:r>
+              <w:t xml:space="preserve">(0.059)</w:t>
+            </w:r>
+          </w:p>
+        </w:tc>
+        <w:tc>
+          <w:tcPr/>
+          <w:p>
+            <w:pPr>
+              <w:pStyle w:val="Compact"/>
+            </w:pPr>
+            <w:r>
+              <w:t xml:space="preserve">(0.065)</w:t>
+            </w:r>
+          </w:p>
+        </w:tc>
+        <w:tc>
+          <w:tcPr/>
+          <w:p>
+            <w:pPr>
+              <w:pStyle w:val="Compact"/>
+            </w:pPr>
+            <w:r>
+              <w:t xml:space="preserve">(0.058)</w:t>
+            </w:r>
+          </w:p>
+        </w:tc>
+        <w:tc>
+          <w:tcPr/>
+          <w:p>
+            <w:pPr>
+              <w:pStyle w:val="Compact"/>
+            </w:pPr>
+            <w:r>
+              <w:t xml:space="preserve">(0.088)</w:t>
+            </w:r>
+          </w:p>
+        </w:tc>
+        <w:tc>
+          <w:tcPr/>
+          <w:p>
+            <w:pPr>
+              <w:pStyle w:val="Compact"/>
+            </w:pPr>
+            <w:r>
+              <w:t xml:space="preserve">(0.039)</w:t>
             </w:r>
           </w:p>
         </w:tc>
@@ -1601,73 +1601,73 @@
               <w:pStyle w:val="Compact"/>
             </w:pPr>
             <w:r>
-              <w:t xml:space="preserve">-0.242</w:t>
-            </w:r>
-          </w:p>
-        </w:tc>
-        <w:tc>
-          <w:tcPr/>
-          <w:p>
-            <w:pPr>
-              <w:pStyle w:val="Compact"/>
-            </w:pPr>
-            <w:r>
-              <w:t xml:space="preserve">-0.241</w:t>
-            </w:r>
-          </w:p>
-        </w:tc>
-        <w:tc>
-          <w:tcPr/>
-          <w:p>
-            <w:pPr>
-              <w:pStyle w:val="Compact"/>
-            </w:pPr>
-            <w:r>
-              <w:t xml:space="preserve">-0.202</w:t>
-            </w:r>
-          </w:p>
-        </w:tc>
-        <w:tc>
-          <w:tcPr/>
-          <w:p>
-            <w:pPr>
-              <w:pStyle w:val="Compact"/>
-            </w:pPr>
-            <w:r>
-              <w:t xml:space="preserve">-1.041</w:t>
-            </w:r>
-          </w:p>
-        </w:tc>
-        <w:tc>
-          <w:tcPr/>
-          <w:p>
-            <w:pPr>
-              <w:pStyle w:val="Compact"/>
-            </w:pPr>
-            <w:r>
-              <w:t xml:space="preserve">-0.271</w:t>
-            </w:r>
-          </w:p>
-        </w:tc>
-        <w:tc>
-          <w:tcPr/>
-          <w:p>
-            <w:pPr>
-              <w:pStyle w:val="Compact"/>
-            </w:pPr>
-            <w:r>
-              <w:t xml:space="preserve">-0.285</w:t>
-            </w:r>
-          </w:p>
-        </w:tc>
-        <w:tc>
-          <w:tcPr/>
-          <w:p>
-            <w:pPr>
-              <w:pStyle w:val="Compact"/>
-            </w:pPr>
-            <w:r>
-              <w:t xml:space="preserve">-0.093</w:t>
+              <w:t xml:space="preserve">-0.126</w:t>
+            </w:r>
+          </w:p>
+        </w:tc>
+        <w:tc>
+          <w:tcPr/>
+          <w:p>
+            <w:pPr>
+              <w:pStyle w:val="Compact"/>
+            </w:pPr>
+            <w:r>
+              <w:t xml:space="preserve">-0.120</w:t>
+            </w:r>
+          </w:p>
+        </w:tc>
+        <w:tc>
+          <w:tcPr/>
+          <w:p>
+            <w:pPr>
+              <w:pStyle w:val="Compact"/>
+            </w:pPr>
+            <w:r>
+              <w:t xml:space="preserve">-0.131</w:t>
+            </w:r>
+          </w:p>
+        </w:tc>
+        <w:tc>
+          <w:tcPr/>
+          <w:p>
+            <w:pPr>
+              <w:pStyle w:val="Compact"/>
+            </w:pPr>
+            <w:r>
+              <w:t xml:space="preserve">-0.050</w:t>
+            </w:r>
+          </w:p>
+        </w:tc>
+        <w:tc>
+          <w:tcPr/>
+          <w:p>
+            <w:pPr>
+              <w:pStyle w:val="Compact"/>
+            </w:pPr>
+            <w:r>
+              <w:t xml:space="preserve">-0.055</w:t>
+            </w:r>
+          </w:p>
+        </w:tc>
+        <w:tc>
+          <w:tcPr/>
+          <w:p>
+            <w:pPr>
+              <w:pStyle w:val="Compact"/>
+            </w:pPr>
+            <w:r>
+              <w:t xml:space="preserve">-0.013</w:t>
+            </w:r>
+          </w:p>
+        </w:tc>
+        <w:tc>
+          <w:tcPr/>
+          <w:p>
+            <w:pPr>
+              <w:pStyle w:val="Compact"/>
+            </w:pPr>
+            <w:r>
+              <w:t xml:space="preserve">-0.112</w:t>
             </w:r>
           </w:p>
         </w:tc>
@@ -1688,73 +1688,73 @@
               <w:pStyle w:val="Compact"/>
             </w:pPr>
             <w:r>
-              <w:t xml:space="preserve">(0.116)</w:t>
-            </w:r>
-          </w:p>
-        </w:tc>
-        <w:tc>
-          <w:tcPr/>
-          <w:p>
-            <w:pPr>
-              <w:pStyle w:val="Compact"/>
-            </w:pPr>
-            <w:r>
-              <w:t xml:space="preserve">(0.117)</w:t>
-            </w:r>
-          </w:p>
-        </w:tc>
-        <w:tc>
-          <w:tcPr/>
-          <w:p>
-            <w:pPr>
-              <w:pStyle w:val="Compact"/>
-            </w:pPr>
-            <w:r>
-              <w:t xml:space="preserve">(0.453)</w:t>
-            </w:r>
-          </w:p>
-        </w:tc>
-        <w:tc>
-          <w:tcPr/>
-          <w:p>
-            <w:pPr>
-              <w:pStyle w:val="Compact"/>
-            </w:pPr>
-            <w:r>
-              <w:t xml:space="preserve">(0.086)</w:t>
-            </w:r>
-          </w:p>
-        </w:tc>
-        <w:tc>
-          <w:tcPr/>
-          <w:p>
-            <w:pPr>
-              <w:pStyle w:val="Compact"/>
-            </w:pPr>
-            <w:r>
-              <w:t xml:space="preserve">(0.130)</w:t>
-            </w:r>
-          </w:p>
-        </w:tc>
-        <w:tc>
-          <w:tcPr/>
-          <w:p>
-            <w:pPr>
-              <w:pStyle w:val="Compact"/>
-            </w:pPr>
-            <w:r>
-              <w:t xml:space="preserve">(0.126)</w:t>
-            </w:r>
-          </w:p>
-        </w:tc>
-        <w:tc>
-          <w:tcPr/>
-          <w:p>
-            <w:pPr>
-              <w:pStyle w:val="Compact"/>
-            </w:pPr>
-            <w:r>
-              <w:t xml:space="preserve">(0.075)</w:t>
+              <w:t xml:space="preserve">(0.034)</w:t>
+            </w:r>
+          </w:p>
+        </w:tc>
+        <w:tc>
+          <w:tcPr/>
+          <w:p>
+            <w:pPr>
+              <w:pStyle w:val="Compact"/>
+            </w:pPr>
+            <w:r>
+              <w:t xml:space="preserve">(0.038)</w:t>
+            </w:r>
+          </w:p>
+        </w:tc>
+        <w:tc>
+          <w:tcPr/>
+          <w:p>
+            <w:pPr>
+              <w:pStyle w:val="Compact"/>
+            </w:pPr>
+            <w:r>
+              <w:t xml:space="preserve">(0.079)</w:t>
+            </w:r>
+          </w:p>
+        </w:tc>
+        <w:tc>
+          <w:tcPr/>
+          <w:p>
+            <w:pPr>
+              <w:pStyle w:val="Compact"/>
+            </w:pPr>
+            <w:r>
+              <w:t xml:space="preserve">(0.066)</w:t>
+            </w:r>
+          </w:p>
+        </w:tc>
+        <w:tc>
+          <w:tcPr/>
+          <w:p>
+            <w:pPr>
+              <w:pStyle w:val="Compact"/>
+            </w:pPr>
+            <w:r>
+              <w:t xml:space="preserve">(0.050)</w:t>
+            </w:r>
+          </w:p>
+        </w:tc>
+        <w:tc>
+          <w:tcPr/>
+          <w:p>
+            <w:pPr>
+              <w:pStyle w:val="Compact"/>
+            </w:pPr>
+            <w:r>
+              <w:t xml:space="preserve">(0.080)</w:t>
+            </w:r>
+          </w:p>
+        </w:tc>
+        <w:tc>
+          <w:tcPr/>
+          <w:p>
+            <w:pPr>
+              <w:pStyle w:val="Compact"/>
+            </w:pPr>
+            <w:r>
+              <w:t xml:space="preserve">(0.074)</w:t>
             </w:r>
           </w:p>
         </w:tc>
@@ -1778,6 +1778,17 @@
               <w:pStyle w:val="Compact"/>
             </w:pPr>
             <w:r>
+              <w:t xml:space="preserve">-0.211</w:t>
+            </w:r>
+          </w:p>
+        </w:tc>
+        <w:tc>
+          <w:tcPr/>
+          <w:p>
+            <w:pPr>
+              <w:pStyle w:val="Compact"/>
+            </w:pPr>
+            <w:r>
               <w:t xml:space="preserve">-0.207</w:t>
             </w:r>
           </w:p>
@@ -1789,62 +1800,51 @@
               <w:pStyle w:val="Compact"/>
             </w:pPr>
             <w:r>
-              <w:t xml:space="preserve">-0.206</w:t>
-            </w:r>
-          </w:p>
-        </w:tc>
-        <w:tc>
-          <w:tcPr/>
-          <w:p>
-            <w:pPr>
-              <w:pStyle w:val="Compact"/>
-            </w:pPr>
-            <w:r>
-              <w:t xml:space="preserve">-0.045</w:t>
-            </w:r>
-          </w:p>
-        </w:tc>
-        <w:tc>
-          <w:tcPr/>
-          <w:p>
-            <w:pPr>
-              <w:pStyle w:val="Compact"/>
-            </w:pPr>
-            <w:r>
-              <w:t xml:space="preserve">-0.929</w:t>
-            </w:r>
-          </w:p>
-        </w:tc>
-        <w:tc>
-          <w:tcPr/>
-          <w:p>
-            <w:pPr>
-              <w:pStyle w:val="Compact"/>
-            </w:pPr>
-            <w:r>
-              <w:t xml:space="preserve">-0.365</w:t>
-            </w:r>
-          </w:p>
-        </w:tc>
-        <w:tc>
-          <w:tcPr/>
-          <w:p>
-            <w:pPr>
-              <w:pStyle w:val="Compact"/>
-            </w:pPr>
-            <w:r>
-              <w:t xml:space="preserve">-0.301</w:t>
-            </w:r>
-          </w:p>
-        </w:tc>
-        <w:tc>
-          <w:tcPr/>
-          <w:p>
-            <w:pPr>
-              <w:pStyle w:val="Compact"/>
-            </w:pPr>
-            <w:r>
-              <w:t xml:space="preserve">-0.001</w:t>
+              <w:t xml:space="preserve">-0.144</w:t>
+            </w:r>
+          </w:p>
+        </w:tc>
+        <w:tc>
+          <w:tcPr/>
+          <w:p>
+            <w:pPr>
+              <w:pStyle w:val="Compact"/>
+            </w:pPr>
+            <w:r>
+              <w:t xml:space="preserve">-0.091</w:t>
+            </w:r>
+          </w:p>
+        </w:tc>
+        <w:tc>
+          <w:tcPr/>
+          <w:p>
+            <w:pPr>
+              <w:pStyle w:val="Compact"/>
+            </w:pPr>
+            <w:r>
+              <w:t xml:space="preserve">-0.148</w:t>
+            </w:r>
+          </w:p>
+        </w:tc>
+        <w:tc>
+          <w:tcPr/>
+          <w:p>
+            <w:pPr>
+              <w:pStyle w:val="Compact"/>
+            </w:pPr>
+            <w:r>
+              <w:t xml:space="preserve">-0.116</w:t>
+            </w:r>
+          </w:p>
+        </w:tc>
+        <w:tc>
+          <w:tcPr/>
+          <w:p>
+            <w:pPr>
+              <w:pStyle w:val="Compact"/>
+            </w:pPr>
+            <w:r>
+              <w:t xml:space="preserve">-0.286</w:t>
             </w:r>
           </w:p>
         </w:tc>
@@ -1865,73 +1865,73 @@
               <w:pStyle w:val="Compact"/>
             </w:pPr>
             <w:r>
-              <w:t xml:space="preserve">(0.128)</w:t>
-            </w:r>
-          </w:p>
-        </w:tc>
-        <w:tc>
-          <w:tcPr/>
-          <w:p>
-            <w:pPr>
-              <w:pStyle w:val="Compact"/>
-            </w:pPr>
-            <w:r>
-              <w:t xml:space="preserve">(0.128)</w:t>
-            </w:r>
-          </w:p>
-        </w:tc>
-        <w:tc>
-          <w:tcPr/>
-          <w:p>
-            <w:pPr>
-              <w:pStyle w:val="Compact"/>
-            </w:pPr>
-            <w:r>
-              <w:t xml:space="preserve">(0.453)</w:t>
-            </w:r>
-          </w:p>
-        </w:tc>
-        <w:tc>
-          <w:tcPr/>
-          <w:p>
-            <w:pPr>
-              <w:pStyle w:val="Compact"/>
-            </w:pPr>
-            <w:r>
-              <w:t xml:space="preserve">(0.069)</w:t>
-            </w:r>
-          </w:p>
-        </w:tc>
-        <w:tc>
-          <w:tcPr/>
-          <w:p>
-            <w:pPr>
-              <w:pStyle w:val="Compact"/>
-            </w:pPr>
-            <w:r>
-              <w:t xml:space="preserve">(0.133)</w:t>
-            </w:r>
-          </w:p>
-        </w:tc>
-        <w:tc>
-          <w:tcPr/>
-          <w:p>
-            <w:pPr>
-              <w:pStyle w:val="Compact"/>
-            </w:pPr>
-            <w:r>
-              <w:t xml:space="preserve">(0.149)</w:t>
-            </w:r>
-          </w:p>
-        </w:tc>
-        <w:tc>
-          <w:tcPr/>
-          <w:p>
-            <w:pPr>
-              <w:pStyle w:val="Compact"/>
-            </w:pPr>
-            <w:r>
-              <w:t xml:space="preserve">(0.096)</w:t>
+              <w:t xml:space="preserve">(0.047)</w:t>
+            </w:r>
+          </w:p>
+        </w:tc>
+        <w:tc>
+          <w:tcPr/>
+          <w:p>
+            <w:pPr>
+              <w:pStyle w:val="Compact"/>
+            </w:pPr>
+            <w:r>
+              <w:t xml:space="preserve">(0.052)</w:t>
+            </w:r>
+          </w:p>
+        </w:tc>
+        <w:tc>
+          <w:tcPr/>
+          <w:p>
+            <w:pPr>
+              <w:pStyle w:val="Compact"/>
+            </w:pPr>
+            <w:r>
+              <w:t xml:space="preserve">(0.067)</w:t>
+            </w:r>
+          </w:p>
+        </w:tc>
+        <w:tc>
+          <w:tcPr/>
+          <w:p>
+            <w:pPr>
+              <w:pStyle w:val="Compact"/>
+            </w:pPr>
+            <w:r>
+              <w:t xml:space="preserve">(0.071)</w:t>
+            </w:r>
+          </w:p>
+        </w:tc>
+        <w:tc>
+          <w:tcPr/>
+          <w:p>
+            <w:pPr>
+              <w:pStyle w:val="Compact"/>
+            </w:pPr>
+            <w:r>
+              <w:t xml:space="preserve">(0.068)</w:t>
+            </w:r>
+          </w:p>
+        </w:tc>
+        <w:tc>
+          <w:tcPr/>
+          <w:p>
+            <w:pPr>
+              <w:pStyle w:val="Compact"/>
+            </w:pPr>
+            <w:r>
+              <w:t xml:space="preserve">(0.102)</w:t>
+            </w:r>
+          </w:p>
+        </w:tc>
+        <w:tc>
+          <w:tcPr/>
+          <w:p>
+            <w:pPr>
+              <w:pStyle w:val="Compact"/>
+            </w:pPr>
+            <w:r>
+              <w:t xml:space="preserve">(0.064)</w:t>
             </w:r>
           </w:p>
         </w:tc>
@@ -1963,7 +1963,7 @@
               <w:pStyle w:val="Compact"/>
             </w:pPr>
             <w:r>
-              <w:t xml:space="preserve">0.002</w:t>
+              <w:t xml:space="preserve">0.000</w:t>
             </w:r>
           </w:p>
         </w:tc>
@@ -2032,7 +2032,7 @@
               <w:pStyle w:val="Compact"/>
             </w:pPr>
             <w:r>
-              <w:t xml:space="preserve">(0.003)</w:t>
+              <w:t xml:space="preserve">(0.002)</w:t>
             </w:r>
           </w:p>
         </w:tc>
@@ -2173,7 +2173,7 @@
               <w:pStyle w:val="Compact"/>
             </w:pPr>
             <w:r>
-              <w:t xml:space="preserve">(0.004)</w:t>
+              <w:t xml:space="preserve">(0.003)</w:t>
             </w:r>
           </w:p>
         </w:tc>
@@ -2245,7 +2245,7 @@
               <w:pStyle w:val="Compact"/>
             </w:pPr>
             <w:r>
-              <w:t xml:space="preserve">0.001</w:t>
+              <w:t xml:space="preserve">0.002</w:t>
             </w:r>
           </w:p>
         </w:tc>
@@ -2386,7 +2386,7 @@
               <w:pStyle w:val="Compact"/>
             </w:pPr>
             <w:r>
-              <w:t xml:space="preserve">0.000</w:t>
+              <w:t xml:space="preserve">-0.002</w:t>
             </w:r>
           </w:p>
         </w:tc>
@@ -2455,7 +2455,7 @@
               <w:pStyle w:val="Compact"/>
             </w:pPr>
             <w:r>
-              <w:t xml:space="preserve">(0.005)</w:t>
+              <w:t xml:space="preserve">(0.004)</w:t>
             </w:r>
           </w:p>
         </w:tc>
@@ -2519,73 +2519,73 @@
               <w:pStyle w:val="Compact"/>
             </w:pPr>
             <w:r>
-              <w:t xml:space="preserve">3717</w:t>
-            </w:r>
-          </w:p>
-        </w:tc>
-        <w:tc>
-          <w:tcPr/>
-          <w:p>
-            <w:pPr>
-              <w:pStyle w:val="Compact"/>
-            </w:pPr>
-            <w:r>
-              <w:t xml:space="preserve">3717</w:t>
-            </w:r>
-          </w:p>
-        </w:tc>
-        <w:tc>
-          <w:tcPr/>
-          <w:p>
-            <w:pPr>
-              <w:pStyle w:val="Compact"/>
-            </w:pPr>
-            <w:r>
-              <w:t xml:space="preserve">596</w:t>
-            </w:r>
-          </w:p>
-        </w:tc>
-        <w:tc>
-          <w:tcPr/>
-          <w:p>
-            <w:pPr>
-              <w:pStyle w:val="Compact"/>
-            </w:pPr>
-            <w:r>
-              <w:t xml:space="preserve">837</w:t>
-            </w:r>
-          </w:p>
-        </w:tc>
-        <w:tc>
-          <w:tcPr/>
-          <w:p>
-            <w:pPr>
-              <w:pStyle w:val="Compact"/>
-            </w:pPr>
-            <w:r>
-              <w:t xml:space="preserve">888</w:t>
-            </w:r>
-          </w:p>
-        </w:tc>
-        <w:tc>
-          <w:tcPr/>
-          <w:p>
-            <w:pPr>
-              <w:pStyle w:val="Compact"/>
-            </w:pPr>
-            <w:r>
-              <w:t xml:space="preserve">918</w:t>
-            </w:r>
-          </w:p>
-        </w:tc>
-        <w:tc>
-          <w:tcPr/>
-          <w:p>
-            <w:pPr>
-              <w:pStyle w:val="Compact"/>
-            </w:pPr>
-            <w:r>
-              <w:t xml:space="preserve">478</w:t>
+              <w:t xml:space="preserve">15054</w:t>
+            </w:r>
+          </w:p>
+        </w:tc>
+        <w:tc>
+          <w:tcPr/>
+          <w:p>
+            <w:pPr>
+              <w:pStyle w:val="Compact"/>
+            </w:pPr>
+            <w:r>
+              <w:t xml:space="preserve">15054</w:t>
+            </w:r>
+          </w:p>
+        </w:tc>
+        <w:tc>
+          <w:tcPr/>
+          <w:p>
+            <w:pPr>
+              <w:pStyle w:val="Compact"/>
+            </w:pPr>
+            <w:r>
+              <w:t xml:space="preserve">2541</w:t>
+            </w:r>
+          </w:p>
+        </w:tc>
+        <w:tc>
+          <w:tcPr/>
+          <w:p>
+            <w:pPr>
+              <w:pStyle w:val="Compact"/>
+            </w:pPr>
+            <w:r>
+              <w:t xml:space="preserve">2840</w:t>
+            </w:r>
+          </w:p>
+        </w:tc>
+        <w:tc>
+          <w:tcPr/>
+          <w:p>
+            <w:pPr>
+              <w:pStyle w:val="Compact"/>
+            </w:pPr>
+            <w:r>
+              <w:t xml:space="preserve">3104</w:t>
+            </w:r>
+          </w:p>
+        </w:tc>
+        <w:tc>
+          <w:tcPr/>
+          <w:p>
+            <w:pPr>
+              <w:pStyle w:val="Compact"/>
+            </w:pPr>
+            <w:r>
+              <w:t xml:space="preserve">3272</w:t>
+            </w:r>
+          </w:p>
+        </w:tc>
+        <w:tc>
+          <w:tcPr/>
+          <w:p>
+            <w:pPr>
+              <w:pStyle w:val="Compact"/>
+            </w:pPr>
+            <w:r>
+              <w:t xml:space="preserve">3297</w:t>
             </w:r>
           </w:p>
         </w:tc>
@@ -2609,73 +2609,73 @@
               <w:pStyle w:val="Compact"/>
             </w:pPr>
             <w:r>
-              <w:t xml:space="preserve">0.202</w:t>
-            </w:r>
-          </w:p>
-        </w:tc>
-        <w:tc>
-          <w:tcPr/>
-          <w:p>
-            <w:pPr>
-              <w:pStyle w:val="Compact"/>
-            </w:pPr>
-            <w:r>
-              <w:t xml:space="preserve">0.202</w:t>
-            </w:r>
-          </w:p>
-        </w:tc>
-        <w:tc>
-          <w:tcPr/>
-          <w:p>
-            <w:pPr>
-              <w:pStyle w:val="Compact"/>
-            </w:pPr>
-            <w:r>
-              <w:t xml:space="preserve">0.022</w:t>
-            </w:r>
-          </w:p>
-        </w:tc>
-        <w:tc>
-          <w:tcPr/>
-          <w:p>
-            <w:pPr>
-              <w:pStyle w:val="Compact"/>
-            </w:pPr>
-            <w:r>
-              <w:t xml:space="preserve">0.017</w:t>
-            </w:r>
-          </w:p>
-        </w:tc>
-        <w:tc>
-          <w:tcPr/>
-          <w:p>
-            <w:pPr>
-              <w:pStyle w:val="Compact"/>
-            </w:pPr>
-            <w:r>
-              <w:t xml:space="preserve">0.010</w:t>
-            </w:r>
-          </w:p>
-        </w:tc>
-        <w:tc>
-          <w:tcPr/>
-          <w:p>
-            <w:pPr>
-              <w:pStyle w:val="Compact"/>
-            </w:pPr>
-            <w:r>
-              <w:t xml:space="preserve">0.028</w:t>
-            </w:r>
-          </w:p>
-        </w:tc>
-        <w:tc>
-          <w:tcPr/>
-          <w:p>
-            <w:pPr>
-              <w:pStyle w:val="Compact"/>
-            </w:pPr>
-            <w:r>
-              <w:t xml:space="preserve">0.032</w:t>
+              <w:t xml:space="preserve">0.334</w:t>
+            </w:r>
+          </w:p>
+        </w:tc>
+        <w:tc>
+          <w:tcPr/>
+          <w:p>
+            <w:pPr>
+              <w:pStyle w:val="Compact"/>
+            </w:pPr>
+            <w:r>
+              <w:t xml:space="preserve">0.335</w:t>
+            </w:r>
+          </w:p>
+        </w:tc>
+        <w:tc>
+          <w:tcPr/>
+          <w:p>
+            <w:pPr>
+              <w:pStyle w:val="Compact"/>
+            </w:pPr>
+            <w:r>
+              <w:t xml:space="preserve">0.018</w:t>
+            </w:r>
+          </w:p>
+        </w:tc>
+        <w:tc>
+          <w:tcPr/>
+          <w:p>
+            <w:pPr>
+              <w:pStyle w:val="Compact"/>
+            </w:pPr>
+            <w:r>
+              <w:t xml:space="preserve">0.023</w:t>
+            </w:r>
+          </w:p>
+        </w:tc>
+        <w:tc>
+          <w:tcPr/>
+          <w:p>
+            <w:pPr>
+              <w:pStyle w:val="Compact"/>
+            </w:pPr>
+            <w:r>
+              <w:t xml:space="preserve">0.014</w:t>
+            </w:r>
+          </w:p>
+        </w:tc>
+        <w:tc>
+          <w:tcPr/>
+          <w:p>
+            <w:pPr>
+              <w:pStyle w:val="Compact"/>
+            </w:pPr>
+            <w:r>
+              <w:t xml:space="preserve">0.026</w:t>
+            </w:r>
+          </w:p>
+        </w:tc>
+        <w:tc>
+          <w:tcPr/>
+          <w:p>
+            <w:pPr>
+              <w:pStyle w:val="Compact"/>
+            </w:pPr>
+            <w:r>
+              <w:t xml:space="preserve">0.110</w:t>
             </w:r>
           </w:p>
         </w:tc>
@@ -2699,18 +2699,40 @@
               <w:pStyle w:val="Compact"/>
             </w:pPr>
             <w:r>
-              <w:t xml:space="preserve">0.200</w:t>
-            </w:r>
-          </w:p>
-        </w:tc>
-        <w:tc>
-          <w:tcPr/>
-          <w:p>
-            <w:pPr>
-              <w:pStyle w:val="Compact"/>
-            </w:pPr>
-            <w:r>
-              <w:t xml:space="preserve">0.199</w:t>
+              <w:t xml:space="preserve">0.334</w:t>
+            </w:r>
+          </w:p>
+        </w:tc>
+        <w:tc>
+          <w:tcPr/>
+          <w:p>
+            <w:pPr>
+              <w:pStyle w:val="Compact"/>
+            </w:pPr>
+            <w:r>
+              <w:t xml:space="preserve">0.334</w:t>
+            </w:r>
+          </w:p>
+        </w:tc>
+        <w:tc>
+          <w:tcPr/>
+          <w:p>
+            <w:pPr>
+              <w:pStyle w:val="Compact"/>
+            </w:pPr>
+            <w:r>
+              <w:t xml:space="preserve">0.015</w:t>
+            </w:r>
+          </w:p>
+        </w:tc>
+        <w:tc>
+          <w:tcPr/>
+          <w:p>
+            <w:pPr>
+              <w:pStyle w:val="Compact"/>
+            </w:pPr>
+            <w:r>
+              <w:t xml:space="preserve">0.021</w:t>
             </w:r>
           </w:p>
         </w:tc>
@@ -2732,40 +2754,18 @@
               <w:pStyle w:val="Compact"/>
             </w:pPr>
             <w:r>
-              <w:t xml:space="preserve">0.010</w:t>
-            </w:r>
-          </w:p>
-        </w:tc>
-        <w:tc>
-          <w:tcPr/>
-          <w:p>
-            <w:pPr>
-              <w:pStyle w:val="Compact"/>
-            </w:pPr>
-            <w:r>
-              <w:t xml:space="preserve">0.003</w:t>
-            </w:r>
-          </w:p>
-        </w:tc>
-        <w:tc>
-          <w:tcPr/>
-          <w:p>
-            <w:pPr>
-              <w:pStyle w:val="Compact"/>
-            </w:pPr>
-            <w:r>
-              <w:t xml:space="preserve">0.021</w:t>
-            </w:r>
-          </w:p>
-        </w:tc>
-        <w:tc>
-          <w:tcPr/>
-          <w:p>
-            <w:pPr>
-              <w:pStyle w:val="Compact"/>
-            </w:pPr>
-            <w:r>
-              <w:t xml:space="preserve">0.020</w:t>
+              <w:t xml:space="preserve">0.024</w:t>
+            </w:r>
+          </w:p>
+        </w:tc>
+        <w:tc>
+          <w:tcPr/>
+          <w:p>
+            <w:pPr>
+              <w:pStyle w:val="Compact"/>
+            </w:pPr>
+            <w:r>
+              <w:t xml:space="preserve">0.109</w:t>
             </w:r>
           </w:p>
         </w:tc>
@@ -2789,73 +2789,73 @@
               <w:pStyle w:val="Compact"/>
             </w:pPr>
             <w:r>
-              <w:t xml:space="preserve">5710.2</w:t>
-            </w:r>
-          </w:p>
-        </w:tc>
-        <w:tc>
-          <w:tcPr/>
-          <w:p>
-            <w:pPr>
-              <w:pStyle w:val="Compact"/>
-            </w:pPr>
-            <w:r>
-              <w:t xml:space="preserve">5717.0</w:t>
-            </w:r>
-          </w:p>
-        </w:tc>
-        <w:tc>
-          <w:tcPr/>
-          <w:p>
-            <w:pPr>
-              <w:pStyle w:val="Compact"/>
-            </w:pPr>
-            <w:r>
-              <w:t xml:space="preserve">844.1</w:t>
-            </w:r>
-          </w:p>
-        </w:tc>
-        <w:tc>
-          <w:tcPr/>
-          <w:p>
-            <w:pPr>
-              <w:pStyle w:val="Compact"/>
-            </w:pPr>
-            <w:r>
-              <w:t xml:space="preserve">1164.2</w:t>
-            </w:r>
-          </w:p>
-        </w:tc>
-        <w:tc>
-          <w:tcPr/>
-          <w:p>
-            <w:pPr>
-              <w:pStyle w:val="Compact"/>
-            </w:pPr>
-            <w:r>
-              <w:t xml:space="preserve">1332.9</w:t>
-            </w:r>
-          </w:p>
-        </w:tc>
-        <w:tc>
-          <w:tcPr/>
-          <w:p>
-            <w:pPr>
-              <w:pStyle w:val="Compact"/>
-            </w:pPr>
-            <w:r>
-              <w:t xml:space="preserve">1485.6</w:t>
-            </w:r>
-          </w:p>
-        </w:tc>
-        <w:tc>
-          <w:tcPr/>
-          <w:p>
-            <w:pPr>
-              <w:pStyle w:val="Compact"/>
-            </w:pPr>
-            <w:r>
-              <w:t xml:space="preserve">876.6</w:t>
+              <w:t xml:space="preserve">24394.7</w:t>
+            </w:r>
+          </w:p>
+        </w:tc>
+        <w:tc>
+          <w:tcPr/>
+          <w:p>
+            <w:pPr>
+              <w:pStyle w:val="Compact"/>
+            </w:pPr>
+            <w:r>
+              <w:t xml:space="preserve">24394.6</w:t>
+            </w:r>
+          </w:p>
+        </w:tc>
+        <w:tc>
+          <w:tcPr/>
+          <w:p>
+            <w:pPr>
+              <w:pStyle w:val="Compact"/>
+            </w:pPr>
+            <w:r>
+              <w:t xml:space="preserve">3576.7</w:t>
+            </w:r>
+          </w:p>
+        </w:tc>
+        <w:tc>
+          <w:tcPr/>
+          <w:p>
+            <w:pPr>
+              <w:pStyle w:val="Compact"/>
+            </w:pPr>
+            <w:r>
+              <w:t xml:space="preserve">4021.8</w:t>
+            </w:r>
+          </w:p>
+        </w:tc>
+        <w:tc>
+          <w:tcPr/>
+          <w:p>
+            <w:pPr>
+              <w:pStyle w:val="Compact"/>
+            </w:pPr>
+            <w:r>
+              <w:t xml:space="preserve">4836.2</w:t>
+            </w:r>
+          </w:p>
+        </w:tc>
+        <w:tc>
+          <w:tcPr/>
+          <w:p>
+            <w:pPr>
+              <w:pStyle w:val="Compact"/>
+            </w:pPr>
+            <w:r>
+              <w:t xml:space="preserve">5358.1</w:t>
+            </w:r>
+          </w:p>
+        </w:tc>
+        <w:tc>
+          <w:tcPr/>
+          <w:p>
+            <w:pPr>
+              <w:pStyle w:val="Compact"/>
+            </w:pPr>
+            <w:r>
+              <w:t xml:space="preserve">6256.4</w:t>
             </w:r>
           </w:p>
         </w:tc>
@@ -2879,73 +2879,73 @@
               <w:pStyle w:val="Compact"/>
             </w:pPr>
             <w:r>
-              <w:t xml:space="preserve">5784.9</w:t>
-            </w:r>
-          </w:p>
-        </w:tc>
-        <w:tc>
-          <w:tcPr/>
-          <w:p>
-            <w:pPr>
-              <w:pStyle w:val="Compact"/>
-            </w:pPr>
-            <w:r>
-              <w:t xml:space="preserve">5816.5</w:t>
-            </w:r>
-          </w:p>
-        </w:tc>
-        <w:tc>
-          <w:tcPr/>
-          <w:p>
-            <w:pPr>
-              <w:pStyle w:val="Compact"/>
-            </w:pPr>
-            <w:r>
-              <w:t xml:space="preserve">879.2</w:t>
-            </w:r>
-          </w:p>
-        </w:tc>
-        <w:tc>
-          <w:tcPr/>
-          <w:p>
-            <w:pPr>
-              <w:pStyle w:val="Compact"/>
-            </w:pPr>
-            <w:r>
-              <w:t xml:space="preserve">1202.1</w:t>
-            </w:r>
-          </w:p>
-        </w:tc>
-        <w:tc>
-          <w:tcPr/>
-          <w:p>
-            <w:pPr>
-              <w:pStyle w:val="Compact"/>
-            </w:pPr>
-            <w:r>
-              <w:t xml:space="preserve">1371.2</w:t>
-            </w:r>
-          </w:p>
-        </w:tc>
-        <w:tc>
-          <w:tcPr/>
-          <w:p>
-            <w:pPr>
-              <w:pStyle w:val="Compact"/>
-            </w:pPr>
-            <w:r>
-              <w:t xml:space="preserve">1524.2</w:t>
-            </w:r>
-          </w:p>
-        </w:tc>
-        <w:tc>
-          <w:tcPr/>
-          <w:p>
-            <w:pPr>
-              <w:pStyle w:val="Compact"/>
-            </w:pPr>
-            <w:r>
-              <w:t xml:space="preserve">909.9</w:t>
+              <w:t xml:space="preserve">24486.2</w:t>
+            </w:r>
+          </w:p>
+        </w:tc>
+        <w:tc>
+          <w:tcPr/>
+          <w:p>
+            <w:pPr>
+              <w:pStyle w:val="Compact"/>
+            </w:pPr>
+            <w:r>
+              <w:t xml:space="preserve">24516.5</w:t>
+            </w:r>
+          </w:p>
+        </w:tc>
+        <w:tc>
+          <w:tcPr/>
+          <w:p>
+            <w:pPr>
+              <w:pStyle w:val="Compact"/>
+            </w:pPr>
+            <w:r>
+              <w:t xml:space="preserve">3623.5</w:t>
+            </w:r>
+          </w:p>
+        </w:tc>
+        <w:tc>
+          <w:tcPr/>
+          <w:p>
+            <w:pPr>
+              <w:pStyle w:val="Compact"/>
+            </w:pPr>
+            <w:r>
+              <w:t xml:space="preserve">4069.4</w:t>
+            </w:r>
+          </w:p>
+        </w:tc>
+        <w:tc>
+          <w:tcPr/>
+          <w:p>
+            <w:pPr>
+              <w:pStyle w:val="Compact"/>
+            </w:pPr>
+            <w:r>
+              <w:t xml:space="preserve">4884.5</w:t>
+            </w:r>
+          </w:p>
+        </w:tc>
+        <w:tc>
+          <w:tcPr/>
+          <w:p>
+            <w:pPr>
+              <w:pStyle w:val="Compact"/>
+            </w:pPr>
+            <w:r>
+              <w:t xml:space="preserve">5406.9</w:t>
+            </w:r>
+          </w:p>
+        </w:tc>
+        <w:tc>
+          <w:tcPr/>
+          <w:p>
+            <w:pPr>
+              <w:pStyle w:val="Compact"/>
+            </w:pPr>
+            <w:r>
+              <w:t xml:space="preserve">6305.2</w:t>
             </w:r>
           </w:p>
         </w:tc>
@@ -2969,61 +2969,6 @@
               <w:pStyle w:val="Compact"/>
             </w:pPr>
             <w:r>
-              <w:t xml:space="preserve">0.52</w:t>
-            </w:r>
-          </w:p>
-        </w:tc>
-        <w:tc>
-          <w:tcPr/>
-          <w:p>
-            <w:pPr>
-              <w:pStyle w:val="Compact"/>
-            </w:pPr>
-            <w:r>
-              <w:t xml:space="preserve">0.52</w:t>
-            </w:r>
-          </w:p>
-        </w:tc>
-        <w:tc>
-          <w:tcPr/>
-          <w:p>
-            <w:pPr>
-              <w:pStyle w:val="Compact"/>
-            </w:pPr>
-            <w:r>
-              <w:t xml:space="preserve">0.48</w:t>
-            </w:r>
-          </w:p>
-        </w:tc>
-        <w:tc>
-          <w:tcPr/>
-          <w:p>
-            <w:pPr>
-              <w:pStyle w:val="Compact"/>
-            </w:pPr>
-            <w:r>
-              <w:t xml:space="preserve">0.48</w:t>
-            </w:r>
-          </w:p>
-        </w:tc>
-        <w:tc>
-          <w:tcPr/>
-          <w:p>
-            <w:pPr>
-              <w:pStyle w:val="Compact"/>
-            </w:pPr>
-            <w:r>
-              <w:t xml:space="preserve">0.51</w:t>
-            </w:r>
-          </w:p>
-        </w:tc>
-        <w:tc>
-          <w:tcPr/>
-          <w:p>
-            <w:pPr>
-              <w:pStyle w:val="Compact"/>
-            </w:pPr>
-            <w:r>
               <w:t xml:space="preserve">0.54</w:t>
             </w:r>
           </w:p>
@@ -3035,7 +2980,62 @@
               <w:pStyle w:val="Compact"/>
             </w:pPr>
             <w:r>
-              <w:t xml:space="preserve">0.60</w:t>
+              <w:t xml:space="preserve">0.54</w:t>
+            </w:r>
+          </w:p>
+        </w:tc>
+        <w:tc>
+          <w:tcPr/>
+          <w:p>
+            <w:pPr>
+              <w:pStyle w:val="Compact"/>
+            </w:pPr>
+            <w:r>
+              <w:t xml:space="preserve">0.49</w:t>
+            </w:r>
+          </w:p>
+        </w:tc>
+        <w:tc>
+          <w:tcPr/>
+          <w:p>
+            <w:pPr>
+              <w:pStyle w:val="Compact"/>
+            </w:pPr>
+            <w:r>
+              <w:t xml:space="preserve">0.49</w:t>
+            </w:r>
+          </w:p>
+        </w:tc>
+        <w:tc>
+          <w:tcPr/>
+          <w:p>
+            <w:pPr>
+              <w:pStyle w:val="Compact"/>
+            </w:pPr>
+            <w:r>
+              <w:t xml:space="preserve">0.53</w:t>
+            </w:r>
+          </w:p>
+        </w:tc>
+        <w:tc>
+          <w:tcPr/>
+          <w:p>
+            <w:pPr>
+              <w:pStyle w:val="Compact"/>
+            </w:pPr>
+            <w:r>
+              <w:t xml:space="preserve">0.55</w:t>
+            </w:r>
+          </w:p>
+        </w:tc>
+        <w:tc>
+          <w:tcPr/>
+          <w:p>
+            <w:pPr>
+              <w:pStyle w:val="Compact"/>
+            </w:pPr>
+            <w:r>
+              <w:t xml:space="preserve">0.62</w:t>
             </w:r>
           </w:p>
         </w:tc>

</xml_diff>